<commit_message>
update HTML notes document to correct hyperlink formatting for web browsers
</commit_message>
<xml_diff>
--- a/NOTES/HTML.docx
+++ b/NOTES/HTML.docx
@@ -1311,8 +1311,18 @@
                 <w:sz w:val="26"/>
                 <w:szCs w:val="26"/>
               </w:rPr>
-              <w:t>1993; 31 years ago</w:t>
-            </w:r>
+              <w:t xml:space="preserve">1993; 31 years </w:t>
+            </w:r>
+            <w:proofErr w:type="gramStart"/>
+            <w:r>
+              <w:rPr>
+                <w:rFonts w:ascii="Verdana" w:hAnsi="Verdana"/>
+                <w:sz w:val="26"/>
+                <w:szCs w:val="26"/>
+              </w:rPr>
+              <w:t>ago</w:t>
+            </w:r>
+            <w:proofErr w:type="gramEnd"/>
           </w:p>
         </w:tc>
       </w:tr>
@@ -4237,7 +4247,25 @@
                 <w:sz w:val="26"/>
                 <w:szCs w:val="26"/>
               </w:rPr>
-              <w:t>Heading are used in HTML to define variable length headings. (h1 to h6)</w:t>
+              <w:t xml:space="preserve">Heading </w:t>
+            </w:r>
+            <w:proofErr w:type="gramStart"/>
+            <w:r>
+              <w:rPr>
+                <w:rFonts w:ascii="Verdana" w:hAnsi="Verdana"/>
+                <w:sz w:val="26"/>
+                <w:szCs w:val="26"/>
+              </w:rPr>
+              <w:t>are</w:t>
+            </w:r>
+            <w:proofErr w:type="gramEnd"/>
+            <w:r>
+              <w:rPr>
+                <w:rFonts w:ascii="Verdana" w:hAnsi="Verdana"/>
+                <w:sz w:val="26"/>
+                <w:szCs w:val="26"/>
+              </w:rPr>
+              <w:t xml:space="preserve"> used in HTML to define variable length headings. (h1 to h6)</w:t>
             </w:r>
           </w:p>
         </w:tc>
@@ -9267,19 +9295,35 @@
               </w:rPr>
               <w:t>, </w:t>
             </w:r>
-            <w:hyperlink r:id="rId94" w:tooltip="UdiWWW" w:history="1">
-              <w:proofErr w:type="spellStart"/>
-              <w:r>
-                <w:rPr>
-                  <w:rStyle w:val="Hyperlink"/>
-                  <w:rFonts w:ascii="Verdana" w:hAnsi="Verdana"/>
-                  <w:sz w:val="26"/>
-                  <w:szCs w:val="26"/>
-                </w:rPr>
-                <w:t>UdiWWW</w:t>
-              </w:r>
-              <w:proofErr w:type="spellEnd"/>
-            </w:hyperlink>
+            <w:proofErr w:type="spellStart"/>
+            <w:r>
+              <w:fldChar w:fldCharType="begin"/>
+            </w:r>
+            <w:r>
+              <w:instrText>HYPERLINK "https://en.wikipedia.org/wiki/UdiWWW" \o "UdiWWW"</w:instrText>
+            </w:r>
+            <w:r>
+              <w:fldChar w:fldCharType="separate"/>
+            </w:r>
+            <w:r>
+              <w:rPr>
+                <w:rStyle w:val="Hyperlink"/>
+                <w:rFonts w:ascii="Verdana" w:hAnsi="Verdana"/>
+                <w:sz w:val="26"/>
+                <w:szCs w:val="26"/>
+              </w:rPr>
+              <w:t>UdiWWW</w:t>
+            </w:r>
+            <w:proofErr w:type="spellEnd"/>
+            <w:r>
+              <w:rPr>
+                <w:rStyle w:val="Hyperlink"/>
+                <w:rFonts w:ascii="Verdana" w:hAnsi="Verdana"/>
+                <w:sz w:val="26"/>
+                <w:szCs w:val="26"/>
+              </w:rPr>
+              <w:fldChar w:fldCharType="end"/>
+            </w:r>
             <w:r>
               <w:rPr>
                 <w:rFonts w:ascii="Verdana" w:hAnsi="Verdana"/>
@@ -9288,7 +9332,7 @@
               </w:rPr>
               <w:t>,</w:t>
             </w:r>
-            <w:hyperlink r:id="rId95" w:anchor="cite_note-47" w:history="1">
+            <w:hyperlink r:id="rId94" w:anchor="cite_note-47" w:history="1">
               <w:r>
                 <w:rPr>
                   <w:rStyle w:val="Hyperlink"/>
@@ -9347,7 +9391,7 @@
                 <w:szCs w:val="26"/>
               </w:rPr>
             </w:pPr>
-            <w:hyperlink r:id="rId96" w:tooltip="Amaya (web browser)" w:history="1">
+            <w:hyperlink r:id="rId95" w:tooltip="Amaya (web browser)" w:history="1">
               <w:r>
                 <w:rPr>
                   <w:rStyle w:val="Hyperlink"/>
@@ -9366,7 +9410,7 @@
               </w:rPr>
               <w:t> 0.9,</w:t>
             </w:r>
-            <w:hyperlink r:id="rId97" w:anchor="cite_note-amaya-48" w:history="1">
+            <w:hyperlink r:id="rId96" w:anchor="cite_note-amaya-48" w:history="1">
               <w:r>
                 <w:rPr>
                   <w:rStyle w:val="Hyperlink"/>
@@ -9386,7 +9430,7 @@
               </w:rPr>
               <w:t> </w:t>
             </w:r>
-            <w:hyperlink r:id="rId98" w:tooltip="Arachne (web browser)" w:history="1">
+            <w:hyperlink r:id="rId97" w:tooltip="Arachne (web browser)" w:history="1">
               <w:r>
                 <w:rPr>
                   <w:rStyle w:val="Hyperlink"/>
@@ -9521,7 +9565,7 @@
               </w:rPr>
               <w:t>, </w:t>
             </w:r>
-            <w:hyperlink r:id="rId99" w:tooltip="Internet Explorer 3" w:history="1">
+            <w:hyperlink r:id="rId98" w:tooltip="Internet Explorer 3" w:history="1">
               <w:r>
                 <w:rPr>
                   <w:rStyle w:val="Hyperlink"/>
@@ -9540,7 +9584,7 @@
               </w:rPr>
               <w:t>.0, Netscape Navigator 3.0, </w:t>
             </w:r>
-            <w:hyperlink r:id="rId100" w:tooltip="Opera 2.0" w:history="1">
+            <w:hyperlink r:id="rId99" w:tooltip="Opera 2.0" w:history="1">
               <w:r>
                 <w:rPr>
                   <w:rStyle w:val="Hyperlink"/>
@@ -9617,7 +9661,7 @@
               </w:rPr>
               <w:t> 1.5,</w:t>
             </w:r>
-            <w:hyperlink r:id="rId101" w:anchor="cite_note-49" w:history="1">
+            <w:hyperlink r:id="rId100" w:anchor="cite_note-49" w:history="1">
               <w:r>
                 <w:rPr>
                   <w:rStyle w:val="Hyperlink"/>
@@ -9637,7 +9681,7 @@
               </w:rPr>
               <w:t> </w:t>
             </w:r>
-            <w:hyperlink r:id="rId102" w:tooltip="Voyager (web browser)" w:history="1">
+            <w:hyperlink r:id="rId101" w:tooltip="Voyager (web browser)" w:history="1">
               <w:r>
                 <w:rPr>
                   <w:rStyle w:val="Hyperlink"/>
@@ -9692,7 +9736,7 @@
                 <w:szCs w:val="26"/>
               </w:rPr>
             </w:pPr>
-            <w:hyperlink r:id="rId103" w:tooltip="Amaya (web browser)" w:history="1">
+            <w:hyperlink r:id="rId102" w:tooltip="Amaya (web browser)" w:history="1">
               <w:r>
                 <w:rPr>
                   <w:rStyle w:val="Hyperlink"/>
@@ -9711,7 +9755,7 @@
               </w:rPr>
               <w:t> 1.0, </w:t>
             </w:r>
-            <w:hyperlink r:id="rId104" w:anchor="cite_note-amaya-48" w:history="1">
+            <w:hyperlink r:id="rId103" w:anchor="cite_note-amaya-48" w:history="1">
               <w:r>
                 <w:rPr>
                   <w:rStyle w:val="Hyperlink"/>
@@ -9731,7 +9775,7 @@
               </w:rPr>
               <w:t> </w:t>
             </w:r>
-            <w:hyperlink r:id="rId105" w:tooltip="Internet Explorer 4.0" w:history="1">
+            <w:hyperlink r:id="rId104" w:tooltip="Internet Explorer 4.0" w:history="1">
               <w:r>
                 <w:rPr>
                   <w:rStyle w:val="Hyperlink"/>
@@ -9750,7 +9794,7 @@
               </w:rPr>
               <w:t>, Netscape Navigator 4.0, </w:t>
             </w:r>
-            <w:hyperlink r:id="rId106" w:tooltip="Netscape Communicator" w:history="1">
+            <w:hyperlink r:id="rId105" w:tooltip="Netscape Communicator" w:history="1">
               <w:r>
                 <w:rPr>
                   <w:rStyle w:val="Hyperlink"/>
@@ -9769,7 +9813,7 @@
               </w:rPr>
               <w:t> 4.0, </w:t>
             </w:r>
-            <w:hyperlink r:id="rId107" w:tooltip="Opera 3.0" w:history="1">
+            <w:hyperlink r:id="rId106" w:tooltip="Opera 3.0" w:history="1">
               <w:r>
                 <w:rPr>
                   <w:rStyle w:val="Hyperlink"/>
@@ -9780,7 +9824,7 @@
                 <w:t>Opera 3.0</w:t>
               </w:r>
             </w:hyperlink>
-            <w:hyperlink r:id="rId108" w:anchor="cite_note-50" w:history="1">
+            <w:hyperlink r:id="rId107" w:anchor="cite_note-50" w:history="1">
               <w:r>
                 <w:rPr>
                   <w:rStyle w:val="Hyperlink"/>
@@ -9839,7 +9883,7 @@
                 <w:szCs w:val="26"/>
               </w:rPr>
             </w:pPr>
-            <w:hyperlink r:id="rId109" w:tooltip="ICab" w:history="1">
+            <w:hyperlink r:id="rId108" w:tooltip="ICab" w:history="1">
               <w:r>
                 <w:rPr>
                   <w:rStyle w:val="Hyperlink"/>
@@ -9858,7 +9902,7 @@
               </w:rPr>
               <w:t>, </w:t>
             </w:r>
-            <w:hyperlink r:id="rId110" w:tooltip="Mozilla Application Suite" w:history="1">
+            <w:hyperlink r:id="rId109" w:tooltip="Mozilla Application Suite" w:history="1">
               <w:r>
                 <w:rPr>
                   <w:rStyle w:val="Hyperlink"/>
@@ -9913,7 +9957,7 @@
                 <w:szCs w:val="26"/>
               </w:rPr>
             </w:pPr>
-            <w:hyperlink r:id="rId111" w:tooltip="Amaya (web browser)" w:history="1">
+            <w:hyperlink r:id="rId110" w:tooltip="Amaya (web browser)" w:history="1">
               <w:r>
                 <w:rPr>
                   <w:rStyle w:val="Hyperlink"/>
@@ -9932,7 +9976,7 @@
               </w:rPr>
               <w:t> 2.0,</w:t>
             </w:r>
-            <w:hyperlink r:id="rId112" w:anchor="cite_note-amaya-48" w:history="1">
+            <w:hyperlink r:id="rId111" w:anchor="cite_note-amaya-48" w:history="1">
               <w:r>
                 <w:rPr>
                   <w:rStyle w:val="Hyperlink"/>
@@ -9952,7 +9996,7 @@
               </w:rPr>
               <w:t> Mozilla M3, </w:t>
             </w:r>
-            <w:hyperlink r:id="rId113" w:tooltip="Internet Explorer 5.0" w:history="1">
+            <w:hyperlink r:id="rId112" w:tooltip="Internet Explorer 5.0" w:history="1">
               <w:r>
                 <w:rPr>
                   <w:rStyle w:val="Hyperlink"/>
@@ -10010,7 +10054,7 @@
                 <w:szCs w:val="26"/>
               </w:rPr>
             </w:pPr>
-            <w:hyperlink r:id="rId114" w:tooltip="Amaya (web browser)" w:history="1">
+            <w:hyperlink r:id="rId113" w:tooltip="Amaya (web browser)" w:history="1">
               <w:r>
                 <w:rPr>
                   <w:rStyle w:val="Hyperlink"/>
@@ -10029,7 +10073,7 @@
               </w:rPr>
               <w:t> 3.0</w:t>
             </w:r>
-            <w:hyperlink r:id="rId115" w:anchor="cite_note-amaya-48" w:history="1">
+            <w:hyperlink r:id="rId114" w:anchor="cite_note-amaya-48" w:history="1">
               <w:r>
                 <w:rPr>
                   <w:rStyle w:val="Hyperlink"/>
@@ -10049,7 +10093,7 @@
               </w:rPr>
               <w:t>, </w:t>
             </w:r>
-            <w:hyperlink r:id="rId116" w:tooltip="Amaya (web browser)" w:history="1">
+            <w:hyperlink r:id="rId115" w:tooltip="Amaya (web browser)" w:history="1">
               <w:r>
                 <w:rPr>
                   <w:rStyle w:val="Hyperlink"/>
@@ -10068,7 +10112,7 @@
               </w:rPr>
               <w:t> 4.0,</w:t>
             </w:r>
-            <w:hyperlink r:id="rId117" w:anchor="cite_note-amaya-48" w:history="1">
+            <w:hyperlink r:id="rId116" w:anchor="cite_note-amaya-48" w:history="1">
               <w:r>
                 <w:rPr>
                   <w:rStyle w:val="Hyperlink"/>
@@ -10088,7 +10132,7 @@
               </w:rPr>
               <w:t> </w:t>
             </w:r>
-            <w:hyperlink r:id="rId118" w:tooltip="K-Meleon" w:history="1">
+            <w:hyperlink r:id="rId117" w:tooltip="K-Meleon" w:history="1">
               <w:r>
                 <w:rPr>
                   <w:rStyle w:val="Hyperlink"/>
@@ -10176,7 +10220,7 @@
               </w:rPr>
               <w:t>, </w:t>
             </w:r>
-            <w:hyperlink r:id="rId119" w:tooltip="Netscape 6" w:history="1">
+            <w:hyperlink r:id="rId118" w:tooltip="Netscape 6" w:history="1">
               <w:r>
                 <w:rPr>
                   <w:rStyle w:val="Hyperlink"/>
@@ -10195,7 +10239,7 @@
               </w:rPr>
               <w:t>, </w:t>
             </w:r>
-            <w:hyperlink r:id="rId120" w:tooltip="Opera (web browser)" w:history="1">
+            <w:hyperlink r:id="rId119" w:tooltip="Opera (web browser)" w:history="1">
               <w:r>
                 <w:rPr>
                   <w:rStyle w:val="Hyperlink"/>
@@ -10214,7 +10258,7 @@
               </w:rPr>
               <w:t> 4,</w:t>
             </w:r>
-            <w:hyperlink r:id="rId121" w:anchor="cite_note-51" w:history="1">
+            <w:hyperlink r:id="rId120" w:anchor="cite_note-51" w:history="1">
               <w:r>
                 <w:rPr>
                   <w:rStyle w:val="Hyperlink"/>
@@ -10234,7 +10278,7 @@
               </w:rPr>
               <w:t> Opera 5,</w:t>
             </w:r>
-            <w:hyperlink r:id="rId122" w:anchor="cite_note-52" w:history="1">
+            <w:hyperlink r:id="rId121" w:anchor="cite_note-52" w:history="1">
               <w:r>
                 <w:rPr>
                   <w:rStyle w:val="Hyperlink"/>
@@ -10290,7 +10334,7 @@
                 <w:szCs w:val="26"/>
               </w:rPr>
             </w:pPr>
-            <w:hyperlink r:id="rId123" w:tooltip="Amaya (web browser)" w:history="1">
+            <w:hyperlink r:id="rId122" w:tooltip="Amaya (web browser)" w:history="1">
               <w:r>
                 <w:rPr>
                   <w:rStyle w:val="Hyperlink"/>
@@ -10309,7 +10353,7 @@
               </w:rPr>
               <w:t> 5.0,</w:t>
             </w:r>
-            <w:hyperlink r:id="rId124" w:anchor="cite_note-amaya-48" w:history="1">
+            <w:hyperlink r:id="rId123" w:anchor="cite_note-amaya-48" w:history="1">
               <w:r>
                 <w:rPr>
                   <w:rStyle w:val="Hyperlink"/>
@@ -10329,7 +10373,7 @@
               </w:rPr>
               <w:t> </w:t>
             </w:r>
-            <w:hyperlink r:id="rId125" w:tooltip="Internet Explorer 6" w:history="1">
+            <w:hyperlink r:id="rId124" w:tooltip="Internet Explorer 6" w:history="1">
               <w:r>
                 <w:rPr>
                   <w:rStyle w:val="Hyperlink"/>
@@ -10348,7 +10392,7 @@
               </w:rPr>
               <w:t>, </w:t>
             </w:r>
-            <w:hyperlink r:id="rId126" w:tooltip="Galeon" w:history="1">
+            <w:hyperlink r:id="rId125" w:tooltip="Galeon" w:history="1">
               <w:r>
                 <w:rPr>
                   <w:rStyle w:val="Hyperlink"/>
@@ -10367,7 +10411,7 @@
               </w:rPr>
               <w:t> 1.0, Opera 6,</w:t>
             </w:r>
-            <w:hyperlink r:id="rId127" w:anchor="cite_note-53" w:history="1">
+            <w:hyperlink r:id="rId126" w:anchor="cite_note-53" w:history="1">
               <w:r>
                 <w:rPr>
                   <w:rStyle w:val="Hyperlink"/>
@@ -10426,7 +10470,7 @@
                 <w:szCs w:val="26"/>
               </w:rPr>
             </w:pPr>
-            <w:hyperlink r:id="rId128" w:tooltip="Amaya (web browser)" w:history="1">
+            <w:hyperlink r:id="rId127" w:tooltip="Amaya (web browser)" w:history="1">
               <w:r>
                 <w:rPr>
                   <w:rStyle w:val="Hyperlink"/>
@@ -10445,7 +10489,7 @@
               </w:rPr>
               <w:t> 6.0,</w:t>
             </w:r>
-            <w:hyperlink r:id="rId129" w:anchor="cite_note-amaya-48" w:history="1">
+            <w:hyperlink r:id="rId128" w:anchor="cite_note-amaya-48" w:history="1">
               <w:r>
                 <w:rPr>
                   <w:rStyle w:val="Hyperlink"/>
@@ -10465,7 +10509,7 @@
               </w:rPr>
               <w:t> </w:t>
             </w:r>
-            <w:hyperlink r:id="rId130" w:tooltip="Amaya (web browser)" w:history="1">
+            <w:hyperlink r:id="rId129" w:tooltip="Amaya (web browser)" w:history="1">
               <w:r>
                 <w:rPr>
                   <w:rStyle w:val="Hyperlink"/>
@@ -10484,7 +10528,7 @@
               </w:rPr>
               <w:t> 7.0,</w:t>
             </w:r>
-            <w:hyperlink r:id="rId131" w:anchor="cite_note-amaya-48" w:history="1">
+            <w:hyperlink r:id="rId130" w:anchor="cite_note-amaya-48" w:history="1">
               <w:r>
                 <w:rPr>
                   <w:rStyle w:val="Hyperlink"/>
@@ -10496,7 +10540,7 @@
                 <w:t>[48]</w:t>
               </w:r>
             </w:hyperlink>
-            <w:hyperlink r:id="rId132" w:tooltip="Firefox" w:history="1">
+            <w:hyperlink r:id="rId131" w:tooltip="Firefox" w:history="1">
               <w:r>
                 <w:rPr>
                   <w:rStyle w:val="Hyperlink"/>
@@ -10515,7 +10559,7 @@
               </w:rPr>
               <w:t> 0.1, </w:t>
             </w:r>
-            <w:hyperlink r:id="rId133" w:tooltip="Netscape 7" w:history="1">
+            <w:hyperlink r:id="rId132" w:tooltip="Netscape 7" w:history="1">
               <w:r>
                 <w:rPr>
                   <w:rStyle w:val="Hyperlink"/>
@@ -10534,7 +10578,7 @@
               </w:rPr>
               <w:t>, Mozilla 1.0, </w:t>
             </w:r>
-            <w:hyperlink r:id="rId134" w:tooltip="Links (web browser)" w:history="1">
+            <w:hyperlink r:id="rId133" w:tooltip="Links (web browser)" w:history="1">
               <w:r>
                 <w:rPr>
                   <w:rStyle w:val="Hyperlink"/>
@@ -10589,7 +10633,7 @@
                 <w:szCs w:val="26"/>
               </w:rPr>
             </w:pPr>
-            <w:hyperlink r:id="rId135" w:tooltip="Amaya (web browser)" w:history="1">
+            <w:hyperlink r:id="rId134" w:tooltip="Amaya (web browser)" w:history="1">
               <w:r>
                 <w:rPr>
                   <w:rStyle w:val="Hyperlink"/>
@@ -10608,7 +10652,7 @@
               </w:rPr>
               <w:t> 8.0,</w:t>
             </w:r>
-            <w:hyperlink r:id="rId136" w:anchor="cite_note-amaya-48" w:history="1">
+            <w:hyperlink r:id="rId135" w:anchor="cite_note-amaya-48" w:history="1">
               <w:r>
                 <w:rPr>
                   <w:rStyle w:val="Hyperlink"/>
@@ -10628,7 +10672,7 @@
               </w:rPr>
               <w:t> </w:t>
             </w:r>
-            <w:hyperlink r:id="rId137" w:tooltip="GNOME Web" w:history="1">
+            <w:hyperlink r:id="rId136" w:tooltip="GNOME Web" w:history="1">
               <w:r>
                 <w:rPr>
                   <w:rStyle w:val="Hyperlink"/>
@@ -10647,7 +10691,7 @@
               </w:rPr>
               <w:t> 1.0, </w:t>
             </w:r>
-            <w:hyperlink r:id="rId138" w:tooltip="Opera 7" w:history="1">
+            <w:hyperlink r:id="rId137" w:tooltip="Opera 7" w:history="1">
               <w:r>
                 <w:rPr>
                   <w:rStyle w:val="Hyperlink"/>
@@ -10666,7 +10710,7 @@
               </w:rPr>
               <w:t>,</w:t>
             </w:r>
-            <w:hyperlink r:id="rId139" w:anchor="cite_note-54" w:history="1">
+            <w:hyperlink r:id="rId138" w:anchor="cite_note-54" w:history="1">
               <w:r>
                 <w:rPr>
                   <w:rStyle w:val="Hyperlink"/>
@@ -10686,7 +10730,7 @@
               </w:rPr>
               <w:t> </w:t>
             </w:r>
-            <w:hyperlink r:id="rId140" w:tooltip="Safari (web browser)" w:history="1">
+            <w:hyperlink r:id="rId139" w:tooltip="Safari (web browser)" w:history="1">
               <w:r>
                 <w:rPr>
                   <w:rStyle w:val="Hyperlink"/>
@@ -10752,7 +10796,7 @@
                 <w:szCs w:val="26"/>
               </w:rPr>
             </w:pPr>
-            <w:hyperlink r:id="rId141" w:tooltip="Firefox" w:history="1">
+            <w:hyperlink r:id="rId140" w:tooltip="Firefox" w:history="1">
               <w:r>
                 <w:rPr>
                   <w:rStyle w:val="Hyperlink"/>
@@ -10771,7 +10815,7 @@
               </w:rPr>
               <w:t> 1.0, </w:t>
             </w:r>
-            <w:hyperlink r:id="rId142" w:tooltip="Netscape Browser" w:history="1">
+            <w:hyperlink r:id="rId141" w:tooltip="Netscape Browser" w:history="1">
               <w:r>
                 <w:rPr>
                   <w:rStyle w:val="Hyperlink"/>
@@ -10852,7 +10896,7 @@
                 <w:szCs w:val="26"/>
               </w:rPr>
             </w:pPr>
-            <w:hyperlink r:id="rId143" w:tooltip="Amaya (web browser)" w:history="1">
+            <w:hyperlink r:id="rId142" w:tooltip="Amaya (web browser)" w:history="1">
               <w:r>
                 <w:rPr>
                   <w:rStyle w:val="Hyperlink"/>
@@ -10871,7 +10915,7 @@
               </w:rPr>
               <w:t> 9.0,</w:t>
             </w:r>
-            <w:hyperlink r:id="rId144" w:anchor="cite_note-amaya-48" w:history="1">
+            <w:hyperlink r:id="rId143" w:anchor="cite_note-amaya-48" w:history="1">
               <w:r>
                 <w:rPr>
                   <w:rStyle w:val="Hyperlink"/>
@@ -10891,7 +10935,7 @@
               </w:rPr>
               <w:t> </w:t>
             </w:r>
-            <w:hyperlink r:id="rId145" w:tooltip="AOL Explorer" w:history="1">
+            <w:hyperlink r:id="rId144" w:tooltip="AOL Explorer" w:history="1">
               <w:r>
                 <w:rPr>
                   <w:rStyle w:val="Hyperlink"/>
@@ -10910,7 +10954,7 @@
               </w:rPr>
               <w:t> 1.0, </w:t>
             </w:r>
-            <w:hyperlink r:id="rId146" w:tooltip="GNOME Web" w:history="1">
+            <w:hyperlink r:id="rId145" w:tooltip="GNOME Web" w:history="1">
               <w:r>
                 <w:rPr>
                   <w:rStyle w:val="Hyperlink"/>
@@ -10987,7 +11031,7 @@
               </w:rPr>
               <w:t> 1.0, Netscape Browser 8.0, </w:t>
             </w:r>
-            <w:hyperlink r:id="rId147" w:tooltip="Opera 8" w:history="1">
+            <w:hyperlink r:id="rId146" w:tooltip="Opera 8" w:history="1">
               <w:r>
                 <w:rPr>
                   <w:rStyle w:val="Hyperlink"/>
@@ -11006,7 +11050,7 @@
               </w:rPr>
               <w:t>,</w:t>
             </w:r>
-            <w:hyperlink r:id="rId148" w:anchor="cite_note-55" w:history="1">
+            <w:hyperlink r:id="rId147" w:anchor="cite_note-55" w:history="1">
               <w:r>
                 <w:rPr>
                   <w:rStyle w:val="Hyperlink"/>
@@ -11026,7 +11070,7 @@
               </w:rPr>
               <w:t> </w:t>
             </w:r>
-            <w:hyperlink r:id="rId149" w:tooltip="Safari (web browser)" w:history="1">
+            <w:hyperlink r:id="rId148" w:tooltip="Safari (web browser)" w:history="1">
               <w:r>
                 <w:rPr>
                   <w:rStyle w:val="Hyperlink"/>
@@ -11150,7 +11194,7 @@
                 <w:szCs w:val="26"/>
               </w:rPr>
             </w:pPr>
-            <w:hyperlink r:id="rId150" w:tooltip="Camino (web browser)" w:history="1">
+            <w:hyperlink r:id="rId149" w:tooltip="Camino (web browser)" w:history="1">
               <w:r>
                 <w:rPr>
                   <w:rStyle w:val="Hyperlink"/>
@@ -11169,7 +11213,7 @@
               </w:rPr>
               <w:t> 1.0, </w:t>
             </w:r>
-            <w:hyperlink r:id="rId151" w:tooltip="Galeon" w:history="1">
+            <w:hyperlink r:id="rId150" w:tooltip="Galeon" w:history="1">
               <w:r>
                 <w:rPr>
                   <w:rStyle w:val="Hyperlink"/>
@@ -11188,7 +11232,7 @@
               </w:rPr>
               <w:t> 2.0, </w:t>
             </w:r>
-            <w:hyperlink r:id="rId152" w:tooltip="ICab" w:history="1">
+            <w:hyperlink r:id="rId151" w:tooltip="ICab" w:history="1">
               <w:r>
                 <w:rPr>
                   <w:rStyle w:val="Hyperlink"/>
@@ -11207,7 +11251,7 @@
               </w:rPr>
               <w:t> 3, </w:t>
             </w:r>
-            <w:hyperlink r:id="rId153" w:tooltip="K-Meleon" w:history="1">
+            <w:hyperlink r:id="rId152" w:tooltip="K-Meleon" w:history="1">
               <w:r>
                 <w:rPr>
                   <w:rStyle w:val="Hyperlink"/>
@@ -11237,7 +11281,7 @@
               </w:rPr>
               <w:t> 1.0, </w:t>
             </w:r>
-            <w:hyperlink r:id="rId154" w:tooltip="Mozilla Firefox" w:history="1">
+            <w:hyperlink r:id="rId153" w:tooltip="Mozilla Firefox" w:history="1">
               <w:r>
                 <w:rPr>
                   <w:rStyle w:val="Hyperlink"/>
@@ -11256,7 +11300,7 @@
               </w:rPr>
               <w:t> 2.0, </w:t>
             </w:r>
-            <w:hyperlink r:id="rId155" w:tooltip="Internet Explorer 7" w:history="1">
+            <w:hyperlink r:id="rId154" w:tooltip="Internet Explorer 7" w:history="1">
               <w:r>
                 <w:rPr>
                   <w:rStyle w:val="Hyperlink"/>
@@ -11275,7 +11319,7 @@
               </w:rPr>
               <w:t>, </w:t>
             </w:r>
-            <w:hyperlink r:id="rId156" w:tooltip="Opera (web browser)" w:history="1">
+            <w:hyperlink r:id="rId155" w:tooltip="Opera (web browser)" w:history="1">
               <w:r>
                 <w:rPr>
                   <w:rStyle w:val="Hyperlink"/>
@@ -11294,7 +11338,7 @@
               </w:rPr>
               <w:t> 9,</w:t>
             </w:r>
-            <w:hyperlink r:id="rId157" w:anchor="cite_note-56" w:history="1">
+            <w:hyperlink r:id="rId156" w:anchor="cite_note-56" w:history="1">
               <w:r>
                 <w:rPr>
                   <w:rStyle w:val="Hyperlink"/>
@@ -11416,7 +11460,7 @@
                 <w:szCs w:val="26"/>
               </w:rPr>
             </w:pPr>
-            <w:hyperlink r:id="rId158" w:tooltip="Conkeror" w:history="1">
+            <w:hyperlink r:id="rId157" w:tooltip="Conkeror" w:history="1">
               <w:proofErr w:type="spellStart"/>
               <w:r>
                 <w:rPr>
@@ -11437,7 +11481,7 @@
               </w:rPr>
               <w:t>, </w:t>
             </w:r>
-            <w:hyperlink r:id="rId159" w:tooltip="Flock (web browser)" w:history="1">
+            <w:hyperlink r:id="rId158" w:tooltip="Flock (web browser)" w:history="1">
               <w:r>
                 <w:rPr>
                   <w:rStyle w:val="Hyperlink"/>
@@ -11456,7 +11500,7 @@
               </w:rPr>
               <w:t> 1.0, </w:t>
             </w:r>
-            <w:hyperlink r:id="rId160" w:tooltip="Safari (web browser)" w:history="1">
+            <w:hyperlink r:id="rId159" w:tooltip="Safari (web browser)" w:history="1">
               <w:r>
                 <w:rPr>
                   <w:rStyle w:val="Hyperlink"/>
@@ -11475,7 +11519,7 @@
               </w:rPr>
               <w:t> 3.0, </w:t>
             </w:r>
-            <w:hyperlink r:id="rId161" w:tooltip="Netscape Navigator 9" w:history="1">
+            <w:hyperlink r:id="rId160" w:tooltip="Netscape Navigator 9" w:history="1">
               <w:r>
                 <w:rPr>
                   <w:rStyle w:val="Hyperlink"/>
@@ -11599,7 +11643,7 @@
                 <w:szCs w:val="26"/>
               </w:rPr>
             </w:pPr>
-            <w:hyperlink r:id="rId162" w:tooltip="Google Chrome" w:history="1">
+            <w:hyperlink r:id="rId161" w:tooltip="Google Chrome" w:history="1">
               <w:r>
                 <w:rPr>
                   <w:rStyle w:val="Hyperlink"/>
@@ -11676,7 +11720,7 @@
               </w:rPr>
               <w:t> 2.0, </w:t>
             </w:r>
-            <w:hyperlink r:id="rId163" w:tooltip="Mozilla Firefox" w:history="1">
+            <w:hyperlink r:id="rId162" w:tooltip="Mozilla Firefox" w:history="1">
               <w:r>
                 <w:rPr>
                   <w:rStyle w:val="Hyperlink"/>
@@ -11695,7 +11739,7 @@
               </w:rPr>
               <w:t> 3, </w:t>
             </w:r>
-            <w:hyperlink r:id="rId164" w:tooltip="Opera (web browser)" w:history="1">
+            <w:hyperlink r:id="rId163" w:tooltip="Opera (web browser)" w:history="1">
               <w:r>
                 <w:rPr>
                   <w:rStyle w:val="Hyperlink"/>
@@ -11714,7 +11758,7 @@
               </w:rPr>
               <w:t> 9.5,</w:t>
             </w:r>
-            <w:hyperlink r:id="rId165" w:anchor="cite_note-57" w:history="1">
+            <w:hyperlink r:id="rId164" w:anchor="cite_note-57" w:history="1">
               <w:r>
                 <w:rPr>
                   <w:rStyle w:val="Hyperlink"/>
@@ -11734,7 +11778,7 @@
               </w:rPr>
               <w:t>, </w:t>
             </w:r>
-            <w:hyperlink r:id="rId166" w:tooltip="Safari (web browser)" w:history="1">
+            <w:hyperlink r:id="rId165" w:tooltip="Safari (web browser)" w:history="1">
               <w:r>
                 <w:rPr>
                   <w:rStyle w:val="Hyperlink"/>
@@ -11820,7 +11864,7 @@
               </w:rPr>
               <w:t>, </w:t>
             </w:r>
-            <w:hyperlink r:id="rId167" w:tooltip="Amaya (web browser)" w:history="1">
+            <w:hyperlink r:id="rId166" w:tooltip="Amaya (web browser)" w:history="1">
               <w:r>
                 <w:rPr>
                   <w:rStyle w:val="Hyperlink"/>
@@ -11839,7 +11883,7 @@
               </w:rPr>
               <w:t> 10.0</w:t>
             </w:r>
-            <w:hyperlink r:id="rId168" w:anchor="cite_note-amaya-48" w:history="1">
+            <w:hyperlink r:id="rId167" w:anchor="cite_note-amaya-48" w:history="1">
               <w:r>
                 <w:rPr>
                   <w:rStyle w:val="Hyperlink"/>
@@ -11859,7 +11903,7 @@
               </w:rPr>
               <w:t>, </w:t>
             </w:r>
-            <w:hyperlink r:id="rId169" w:tooltip="Flock (web browser)" w:history="1">
+            <w:hyperlink r:id="rId168" w:tooltip="Flock (web browser)" w:history="1">
               <w:r>
                 <w:rPr>
                   <w:rStyle w:val="Hyperlink"/>
@@ -11878,7 +11922,7 @@
               </w:rPr>
               <w:t> 2, </w:t>
             </w:r>
-            <w:hyperlink r:id="rId170" w:tooltip="Amaya (web browser)" w:history="1">
+            <w:hyperlink r:id="rId169" w:tooltip="Amaya (web browser)" w:history="1">
               <w:r>
                 <w:rPr>
                   <w:rStyle w:val="Hyperlink"/>
@@ -11897,7 +11941,7 @@
               </w:rPr>
               <w:t> 11.0</w:t>
             </w:r>
-            <w:hyperlink r:id="rId171" w:anchor="cite_note-amaya-48" w:history="1">
+            <w:hyperlink r:id="rId170" w:anchor="cite_note-amaya-48" w:history="1">
               <w:r>
                 <w:rPr>
                   <w:rStyle w:val="Hyperlink"/>
@@ -11953,7 +11997,7 @@
                 <w:szCs w:val="26"/>
               </w:rPr>
             </w:pPr>
-            <w:hyperlink r:id="rId172" w:tooltip="Google Chrome" w:history="1">
+            <w:hyperlink r:id="rId171" w:tooltip="Google Chrome" w:history="1">
               <w:r>
                 <w:rPr>
                   <w:rStyle w:val="Hyperlink"/>
@@ -11972,7 +12016,7 @@
               </w:rPr>
               <w:t> 2–3, </w:t>
             </w:r>
-            <w:hyperlink r:id="rId173" w:tooltip="Mozilla Firefox" w:history="1">
+            <w:hyperlink r:id="rId172" w:tooltip="Mozilla Firefox" w:history="1">
               <w:r>
                 <w:rPr>
                   <w:rStyle w:val="Hyperlink"/>
@@ -11991,7 +12035,7 @@
               </w:rPr>
               <w:t> 3.5, </w:t>
             </w:r>
-            <w:hyperlink r:id="rId174" w:tooltip="Internet Explorer 8" w:history="1">
+            <w:hyperlink r:id="rId173" w:tooltip="Internet Explorer 8" w:history="1">
               <w:r>
                 <w:rPr>
                   <w:rStyle w:val="Hyperlink"/>
@@ -12010,7 +12054,7 @@
               </w:rPr>
               <w:t>, </w:t>
             </w:r>
-            <w:hyperlink r:id="rId175" w:tooltip="Opera (web browser)" w:history="1">
+            <w:hyperlink r:id="rId174" w:tooltip="Opera (web browser)" w:history="1">
               <w:r>
                 <w:rPr>
                   <w:rStyle w:val="Hyperlink"/>
@@ -12029,7 +12073,7 @@
               </w:rPr>
               <w:t> 10,</w:t>
             </w:r>
-            <w:hyperlink r:id="rId176" w:anchor="cite_note-58" w:history="1">
+            <w:hyperlink r:id="rId175" w:anchor="cite_note-58" w:history="1">
               <w:r>
                 <w:rPr>
                   <w:rStyle w:val="Hyperlink"/>
@@ -12049,7 +12093,7 @@
               </w:rPr>
               <w:t>, </w:t>
             </w:r>
-            <w:hyperlink r:id="rId177" w:tooltip="Safari (web browser)" w:history="1">
+            <w:hyperlink r:id="rId176" w:tooltip="Safari (web browser)" w:history="1">
               <w:r>
                 <w:rPr>
                   <w:rStyle w:val="Hyperlink"/>
@@ -12126,7 +12170,7 @@
               </w:rPr>
               <w:t> 2, </w:t>
             </w:r>
-            <w:hyperlink r:id="rId178" w:tooltip="Camino (web browser)" w:history="1">
+            <w:hyperlink r:id="rId177" w:tooltip="Camino (web browser)" w:history="1">
               <w:r>
                 <w:rPr>
                   <w:rStyle w:val="Hyperlink"/>
@@ -12145,7 +12189,7 @@
               </w:rPr>
               <w:t> 2, </w:t>
             </w:r>
-            <w:hyperlink r:id="rId179" w:tooltip="Surf (web browser)" w:history="1">
+            <w:hyperlink r:id="rId178" w:tooltip="Surf (web browser)" w:history="1">
               <w:r>
                 <w:rPr>
                   <w:rStyle w:val="Hyperlink"/>
@@ -12164,7 +12208,7 @@
               </w:rPr>
               <w:t>, </w:t>
             </w:r>
-            <w:hyperlink r:id="rId180" w:tooltip="Pale Moon" w:history="1">
+            <w:hyperlink r:id="rId179" w:tooltip="Pale Moon" w:history="1">
               <w:r>
                 <w:rPr>
                   <w:rStyle w:val="Hyperlink"/>
@@ -12183,7 +12227,7 @@
               </w:rPr>
               <w:t> 3.0</w:t>
             </w:r>
-            <w:hyperlink r:id="rId181" w:anchor="cite_note-History_of_the_Pale_Moon-59" w:history="1">
+            <w:hyperlink r:id="rId180" w:anchor="cite_note-History_of_the_Pale_Moon-59" w:history="1">
               <w:r>
                 <w:rPr>
                   <w:rStyle w:val="Hyperlink"/>
@@ -12243,7 +12287,7 @@
                 <w:szCs w:val="26"/>
               </w:rPr>
             </w:pPr>
-            <w:hyperlink r:id="rId182" w:tooltip="Google Chrome" w:history="1">
+            <w:hyperlink r:id="rId181" w:tooltip="Google Chrome" w:history="1">
               <w:r>
                 <w:rPr>
                   <w:rStyle w:val="Hyperlink"/>
@@ -12262,7 +12306,7 @@
               </w:rPr>
               <w:t> 4–8, </w:t>
             </w:r>
-            <w:hyperlink r:id="rId183" w:tooltip="Mozilla Firefox" w:history="1">
+            <w:hyperlink r:id="rId182" w:tooltip="Mozilla Firefox" w:history="1">
               <w:r>
                 <w:rPr>
                   <w:rStyle w:val="Hyperlink"/>
@@ -12281,7 +12325,7 @@
               </w:rPr>
               <w:t> 3.6, </w:t>
             </w:r>
-            <w:hyperlink r:id="rId184" w:tooltip="Opera (web browser)" w:history="1">
+            <w:hyperlink r:id="rId183" w:tooltip="Opera (web browser)" w:history="1">
               <w:r>
                 <w:rPr>
                   <w:rStyle w:val="Hyperlink"/>
@@ -12300,7 +12344,7 @@
               </w:rPr>
               <w:t> 10.50,</w:t>
             </w:r>
-            <w:hyperlink r:id="rId185" w:anchor="cite_note-60" w:history="1">
+            <w:hyperlink r:id="rId184" w:anchor="cite_note-60" w:history="1">
               <w:r>
                 <w:rPr>
                   <w:rStyle w:val="Hyperlink"/>
@@ -12320,7 +12364,7 @@
               </w:rPr>
               <w:t>, </w:t>
             </w:r>
-            <w:hyperlink r:id="rId186" w:tooltip="Opera (web browser)" w:history="1">
+            <w:hyperlink r:id="rId185" w:tooltip="Opera (web browser)" w:history="1">
               <w:r>
                 <w:rPr>
                   <w:rStyle w:val="Hyperlink"/>
@@ -12339,7 +12383,7 @@
               </w:rPr>
               <w:t> 11, </w:t>
             </w:r>
-            <w:hyperlink r:id="rId187" w:tooltip="Safari (web browser)" w:history="1">
+            <w:hyperlink r:id="rId186" w:tooltip="Safari (web browser)" w:history="1">
               <w:r>
                 <w:rPr>
                   <w:rStyle w:val="Hyperlink"/>
@@ -12358,7 +12402,7 @@
               </w:rPr>
               <w:t> 5, </w:t>
             </w:r>
-            <w:hyperlink r:id="rId188" w:tooltip="K-Meleon" w:history="1">
+            <w:hyperlink r:id="rId187" w:tooltip="K-Meleon" w:history="1">
               <w:r>
                 <w:rPr>
                   <w:rStyle w:val="Hyperlink"/>
@@ -12482,7 +12526,7 @@
                 <w:szCs w:val="26"/>
               </w:rPr>
             </w:pPr>
-            <w:hyperlink r:id="rId189" w:tooltip="Google Chrome" w:history="1">
+            <w:hyperlink r:id="rId188" w:tooltip="Google Chrome" w:history="1">
               <w:r>
                 <w:rPr>
                   <w:rStyle w:val="Hyperlink"/>
@@ -12501,7 +12545,7 @@
               </w:rPr>
               <w:t> 9–16, </w:t>
             </w:r>
-            <w:hyperlink r:id="rId190" w:tooltip="Mozilla Firefox" w:history="1">
+            <w:hyperlink r:id="rId189" w:tooltip="Mozilla Firefox" w:history="1">
               <w:r>
                 <w:rPr>
                   <w:rStyle w:val="Hyperlink"/>
@@ -12520,7 +12564,7 @@
               </w:rPr>
               <w:t> 4–9, </w:t>
             </w:r>
-            <w:hyperlink r:id="rId191" w:tooltip="Internet Explorer 9" w:history="1">
+            <w:hyperlink r:id="rId190" w:tooltip="Internet Explorer 9" w:history="1">
               <w:r>
                 <w:rPr>
                   <w:rStyle w:val="Hyperlink"/>
@@ -12539,7 +12583,7 @@
               </w:rPr>
               <w:t>, </w:t>
             </w:r>
-            <w:hyperlink r:id="rId192" w:tooltip="Opera (web browser)" w:history="1">
+            <w:hyperlink r:id="rId191" w:tooltip="Opera (web browser)" w:history="1">
               <w:r>
                 <w:rPr>
                   <w:rStyle w:val="Hyperlink"/>
@@ -12558,7 +12602,7 @@
               </w:rPr>
               <w:t> 11.50, </w:t>
             </w:r>
-            <w:hyperlink r:id="rId193" w:tooltip="Safari (web browser)" w:history="1">
+            <w:hyperlink r:id="rId192" w:tooltip="Safari (web browser)" w:history="1">
               <w:r>
                 <w:rPr>
                   <w:rStyle w:val="Hyperlink"/>
@@ -12740,7 +12784,7 @@
                 <w:szCs w:val="26"/>
               </w:rPr>
             </w:pPr>
-            <w:hyperlink r:id="rId194" w:tooltip="Google Chrome" w:history="1">
+            <w:hyperlink r:id="rId193" w:tooltip="Google Chrome" w:history="1">
               <w:r>
                 <w:rPr>
                   <w:rStyle w:val="Hyperlink"/>
@@ -12759,7 +12803,7 @@
               </w:rPr>
               <w:t> 17–23, </w:t>
             </w:r>
-            <w:hyperlink r:id="rId195" w:tooltip="Mozilla Firefox" w:history="1">
+            <w:hyperlink r:id="rId194" w:tooltip="Mozilla Firefox" w:history="1">
               <w:r>
                 <w:rPr>
                   <w:rStyle w:val="Hyperlink"/>
@@ -12778,7 +12822,7 @@
               </w:rPr>
               <w:t> 10–17, </w:t>
             </w:r>
-            <w:hyperlink r:id="rId196" w:tooltip="Internet Explorer 10" w:history="1">
+            <w:hyperlink r:id="rId195" w:tooltip="Internet Explorer 10" w:history="1">
               <w:r>
                 <w:rPr>
                   <w:rStyle w:val="Hyperlink"/>
@@ -12797,7 +12841,7 @@
               </w:rPr>
               <w:t>, </w:t>
             </w:r>
-            <w:hyperlink r:id="rId197" w:tooltip="Opera (web browser)" w:history="1">
+            <w:hyperlink r:id="rId196" w:tooltip="Opera (web browser)" w:history="1">
               <w:r>
                 <w:rPr>
                   <w:rStyle w:val="Hyperlink"/>
@@ -12816,7 +12860,7 @@
               </w:rPr>
               <w:t> 12, </w:t>
             </w:r>
-            <w:hyperlink r:id="rId198" w:tooltip="Safari (web browser)" w:history="1">
+            <w:hyperlink r:id="rId197" w:tooltip="Safari (web browser)" w:history="1">
               <w:r>
                 <w:rPr>
                   <w:rStyle w:val="Hyperlink"/>
@@ -12995,7 +13039,7 @@
                 <w:szCs w:val="26"/>
               </w:rPr>
             </w:pPr>
-            <w:hyperlink r:id="rId199" w:tooltip="Google Chrome" w:history="1">
+            <w:hyperlink r:id="rId198" w:tooltip="Google Chrome" w:history="1">
               <w:r>
                 <w:rPr>
                   <w:rStyle w:val="Hyperlink"/>
@@ -13014,7 +13058,7 @@
               </w:rPr>
               <w:t> 24–31, </w:t>
             </w:r>
-            <w:hyperlink r:id="rId200" w:tooltip="Mozilla Firefox" w:history="1">
+            <w:hyperlink r:id="rId199" w:tooltip="Mozilla Firefox" w:history="1">
               <w:r>
                 <w:rPr>
                   <w:rStyle w:val="Hyperlink"/>
@@ -13033,7 +13077,7 @@
               </w:rPr>
               <w:t> 18–26, </w:t>
             </w:r>
-            <w:hyperlink r:id="rId201" w:tooltip="Internet Explorer 11" w:history="1">
+            <w:hyperlink r:id="rId200" w:tooltip="Internet Explorer 11" w:history="1">
               <w:r>
                 <w:rPr>
                   <w:rStyle w:val="Hyperlink"/>
@@ -13052,7 +13096,7 @@
               </w:rPr>
               <w:t>, </w:t>
             </w:r>
-            <w:hyperlink r:id="rId202" w:tooltip="Opera (web browser)" w:history="1">
+            <w:hyperlink r:id="rId201" w:tooltip="Opera (web browser)" w:history="1">
               <w:r>
                 <w:rPr>
                   <w:rStyle w:val="Hyperlink"/>
@@ -13071,7 +13115,7 @@
               </w:rPr>
               <w:t> 15–18, </w:t>
             </w:r>
-            <w:hyperlink r:id="rId203" w:tooltip="Pale Moon" w:history="1">
+            <w:hyperlink r:id="rId202" w:tooltip="Pale Moon" w:history="1">
               <w:r>
                 <w:rPr>
                   <w:rStyle w:val="Hyperlink"/>
@@ -13090,7 +13134,7 @@
               </w:rPr>
               <w:t> 15.4–24.2.2</w:t>
             </w:r>
-            <w:hyperlink r:id="rId204" w:anchor="cite_note-Pale_Moon_release_notes_archived-61" w:history="1">
+            <w:hyperlink r:id="rId203" w:anchor="cite_note-Pale_Moon_release_notes_archived-61" w:history="1">
               <w:r>
                 <w:rPr>
                   <w:rStyle w:val="Hyperlink"/>
@@ -13110,7 +13154,7 @@
               </w:rPr>
               <w:t>, </w:t>
             </w:r>
-            <w:hyperlink r:id="rId205" w:tooltip="Safari (web browser)" w:history="1">
+            <w:hyperlink r:id="rId204" w:tooltip="Safari (web browser)" w:history="1">
               <w:r>
                 <w:rPr>
                   <w:rStyle w:val="Hyperlink"/>
@@ -13234,7 +13278,7 @@
                 <w:szCs w:val="26"/>
               </w:rPr>
             </w:pPr>
-            <w:hyperlink r:id="rId206" w:tooltip="Google Chrome" w:history="1">
+            <w:hyperlink r:id="rId205" w:tooltip="Google Chrome" w:history="1">
               <w:r>
                 <w:rPr>
                   <w:rStyle w:val="Hyperlink"/>
@@ -13253,7 +13297,7 @@
               </w:rPr>
               <w:t> 32–39, </w:t>
             </w:r>
-            <w:hyperlink r:id="rId207" w:tooltip="Mozilla Firefox" w:history="1">
+            <w:hyperlink r:id="rId206" w:tooltip="Mozilla Firefox" w:history="1">
               <w:r>
                 <w:rPr>
                   <w:rStyle w:val="Hyperlink"/>
@@ -13272,7 +13316,7 @@
               </w:rPr>
               <w:t> 27–34, </w:t>
             </w:r>
-            <w:hyperlink r:id="rId208" w:tooltip="Opera (web browser)" w:history="1">
+            <w:hyperlink r:id="rId207" w:tooltip="Opera (web browser)" w:history="1">
               <w:r>
                 <w:rPr>
                   <w:rStyle w:val="Hyperlink"/>
@@ -13291,7 +13335,7 @@
               </w:rPr>
               <w:t> 19–26, </w:t>
             </w:r>
-            <w:hyperlink r:id="rId209" w:tooltip="Pale Moon" w:history="1">
+            <w:hyperlink r:id="rId208" w:tooltip="Pale Moon" w:history="1">
               <w:r>
                 <w:rPr>
                   <w:rStyle w:val="Hyperlink"/>
@@ -13310,7 +13354,7 @@
               </w:rPr>
               <w:t> 24.3.0–25.1.0</w:t>
             </w:r>
-            <w:hyperlink r:id="rId210" w:anchor="cite_note-Pale_Moon_release_notes_archived-61" w:history="1">
+            <w:hyperlink r:id="rId209" w:anchor="cite_note-Pale_Moon_release_notes_archived-61" w:history="1">
               <w:r>
                 <w:rPr>
                   <w:rStyle w:val="Hyperlink"/>
@@ -13330,7 +13374,7 @@
               </w:rPr>
               <w:t>, </w:t>
             </w:r>
-            <w:hyperlink r:id="rId211" w:tooltip="Safari (web browser)" w:history="1">
+            <w:hyperlink r:id="rId210" w:tooltip="Safari (web browser)" w:history="1">
               <w:r>
                 <w:rPr>
                   <w:rStyle w:val="Hyperlink"/>
@@ -13451,7 +13495,7 @@
                 <w:szCs w:val="26"/>
               </w:rPr>
             </w:pPr>
-            <w:hyperlink r:id="rId212" w:tooltip="Google Chrome" w:history="1">
+            <w:hyperlink r:id="rId211" w:tooltip="Google Chrome" w:history="1">
               <w:r>
                 <w:rPr>
                   <w:rStyle w:val="Hyperlink"/>
@@ -13470,7 +13514,7 @@
               </w:rPr>
               <w:t> 40–47, </w:t>
             </w:r>
-            <w:hyperlink r:id="rId213" w:tooltip="Microsoft Edge" w:history="1">
+            <w:hyperlink r:id="rId212" w:tooltip="Microsoft Edge" w:history="1">
               <w:r>
                 <w:rPr>
                   <w:rStyle w:val="Hyperlink"/>
@@ -13489,7 +13533,7 @@
               </w:rPr>
               <w:t>, </w:t>
             </w:r>
-            <w:hyperlink r:id="rId214" w:tooltip="Mozilla Firefox" w:history="1">
+            <w:hyperlink r:id="rId213" w:tooltip="Mozilla Firefox" w:history="1">
               <w:r>
                 <w:rPr>
                   <w:rStyle w:val="Hyperlink"/>
@@ -13508,7 +13552,7 @@
               </w:rPr>
               <w:t> 35–43, </w:t>
             </w:r>
-            <w:hyperlink r:id="rId215" w:tooltip="Opera (web browser)" w:history="1">
+            <w:hyperlink r:id="rId214" w:tooltip="Opera (web browser)" w:history="1">
               <w:r>
                 <w:rPr>
                   <w:rStyle w:val="Hyperlink"/>
@@ -13527,7 +13571,7 @@
               </w:rPr>
               <w:t> 27–34, </w:t>
             </w:r>
-            <w:hyperlink r:id="rId216" w:tooltip="Pale Moon" w:history="1">
+            <w:hyperlink r:id="rId215" w:tooltip="Pale Moon" w:history="1">
               <w:r>
                 <w:rPr>
                   <w:rStyle w:val="Hyperlink"/>
@@ -13546,7 +13590,7 @@
               </w:rPr>
               <w:t> 25.2.0–25.8.1</w:t>
             </w:r>
-            <w:hyperlink r:id="rId217" w:anchor="cite_note-Pale_Moon_release_notes_archived-61" w:history="1">
+            <w:hyperlink r:id="rId216" w:anchor="cite_note-Pale_Moon_release_notes_archived-61" w:history="1">
               <w:r>
                 <w:rPr>
                   <w:rStyle w:val="Hyperlink"/>
@@ -13566,7 +13610,7 @@
               </w:rPr>
               <w:t>, </w:t>
             </w:r>
-            <w:hyperlink r:id="rId218" w:tooltip="Vivaldi (web browser)" w:history="1">
+            <w:hyperlink r:id="rId217" w:tooltip="Vivaldi (web browser)" w:history="1">
               <w:r>
                 <w:rPr>
                   <w:rStyle w:val="Hyperlink"/>
@@ -13624,7 +13668,7 @@
                 <w:szCs w:val="26"/>
               </w:rPr>
             </w:pPr>
-            <w:hyperlink r:id="rId219" w:tooltip="Google Chrome" w:history="1">
+            <w:hyperlink r:id="rId218" w:tooltip="Google Chrome" w:history="1">
               <w:r>
                 <w:rPr>
                   <w:rStyle w:val="Hyperlink"/>
@@ -13643,7 +13687,7 @@
               </w:rPr>
               <w:t> 48–55, </w:t>
             </w:r>
-            <w:hyperlink r:id="rId220" w:tooltip="Mozilla Firefox" w:history="1">
+            <w:hyperlink r:id="rId219" w:tooltip="Mozilla Firefox" w:history="1">
               <w:r>
                 <w:rPr>
                   <w:rStyle w:val="Hyperlink"/>
@@ -13662,7 +13706,7 @@
               </w:rPr>
               <w:t> 44–50, </w:t>
             </w:r>
-            <w:hyperlink r:id="rId221" w:tooltip="Microsoft Edge" w:history="1">
+            <w:hyperlink r:id="rId220" w:tooltip="Microsoft Edge" w:history="1">
               <w:r>
                 <w:rPr>
                   <w:rStyle w:val="Hyperlink"/>
@@ -13681,7 +13725,7 @@
               </w:rPr>
               <w:t> 14, </w:t>
             </w:r>
-            <w:hyperlink r:id="rId222" w:tooltip="Opera (web browser)" w:history="1">
+            <w:hyperlink r:id="rId221" w:tooltip="Opera (web browser)" w:history="1">
               <w:r>
                 <w:rPr>
                   <w:rStyle w:val="Hyperlink"/>
@@ -13700,7 +13744,7 @@
               </w:rPr>
               <w:t> 35–42, </w:t>
             </w:r>
-            <w:hyperlink r:id="rId223" w:tooltip="Pale Moon" w:history="1">
+            <w:hyperlink r:id="rId222" w:tooltip="Pale Moon" w:history="1">
               <w:r>
                 <w:rPr>
                   <w:rStyle w:val="Hyperlink"/>
@@ -13719,7 +13763,7 @@
               </w:rPr>
               <w:t> 26.0.0–27.0.3, </w:t>
             </w:r>
-            <w:hyperlink r:id="rId224" w:tooltip="Safari (web browser)" w:history="1">
+            <w:hyperlink r:id="rId223" w:tooltip="Safari (web browser)" w:history="1">
               <w:r>
                 <w:rPr>
                   <w:rStyle w:val="Hyperlink"/>
@@ -13840,7 +13884,7 @@
                 <w:szCs w:val="26"/>
               </w:rPr>
             </w:pPr>
-            <w:hyperlink r:id="rId225" w:tooltip="Google Chrome" w:history="1">
+            <w:hyperlink r:id="rId224" w:tooltip="Google Chrome" w:history="1">
               <w:r>
                 <w:rPr>
                   <w:rStyle w:val="Hyperlink"/>
@@ -13859,7 +13903,7 @@
               </w:rPr>
               <w:t> 56–60, </w:t>
             </w:r>
-            <w:hyperlink r:id="rId226" w:tooltip="Microsoft Edge" w:history="1">
+            <w:hyperlink r:id="rId225" w:tooltip="Microsoft Edge" w:history="1">
               <w:r>
                 <w:rPr>
                   <w:rStyle w:val="Hyperlink"/>
@@ -13878,7 +13922,7 @@
               </w:rPr>
               <w:t> 15, </w:t>
             </w:r>
-            <w:hyperlink r:id="rId227" w:tooltip="Mozilla Firefox" w:history="1">
+            <w:hyperlink r:id="rId226" w:tooltip="Mozilla Firefox" w:history="1">
               <w:r>
                 <w:rPr>
                   <w:rStyle w:val="Hyperlink"/>
@@ -13897,7 +13941,7 @@
               </w:rPr>
               <w:t> 51–55.0.2, </w:t>
             </w:r>
-            <w:hyperlink r:id="rId228" w:tooltip="Opera (web browser)" w:history="1">
+            <w:hyperlink r:id="rId227" w:tooltip="Opera (web browser)" w:history="1">
               <w:r>
                 <w:rPr>
                   <w:rStyle w:val="Hyperlink"/>
@@ -13916,7 +13960,7 @@
               </w:rPr>
               <w:t> 43–45, </w:t>
             </w:r>
-            <w:hyperlink r:id="rId229" w:tooltip="Opera Software" w:history="1">
+            <w:hyperlink r:id="rId228" w:tooltip="Opera Software" w:history="1">
               <w:r>
                 <w:rPr>
                   <w:rStyle w:val="Hyperlink"/>
@@ -13935,7 +13979,7 @@
               </w:rPr>
               <w:t>, </w:t>
             </w:r>
-            <w:hyperlink r:id="rId230" w:tooltip="Pale Moon" w:history="1">
+            <w:hyperlink r:id="rId229" w:tooltip="Pale Moon" w:history="1">
               <w:r>
                 <w:rPr>
                   <w:rStyle w:val="Hyperlink"/>
@@ -13954,7 +13998,7 @@
               </w:rPr>
               <w:t> 27.1.0–27.6.2, </w:t>
             </w:r>
-            <w:hyperlink r:id="rId231" w:tooltip="Safari (web browser)" w:history="1">
+            <w:hyperlink r:id="rId230" w:tooltip="Safari (web browser)" w:history="1">
               <w:r>
                 <w:rPr>
                   <w:rStyle w:val="Hyperlink"/>
@@ -14012,7 +14056,7 @@
                 <w:szCs w:val="26"/>
               </w:rPr>
             </w:pPr>
-            <w:hyperlink r:id="rId232" w:tooltip="Google Chrome" w:history="1">
+            <w:hyperlink r:id="rId231" w:tooltip="Google Chrome" w:history="1">
               <w:r>
                 <w:rPr>
                   <w:rStyle w:val="Hyperlink"/>
@@ -14031,7 +14075,7 @@
               </w:rPr>
               <w:t>, </w:t>
             </w:r>
-            <w:hyperlink r:id="rId233" w:anchor="Release_history" w:tooltip="Firefox version history" w:history="1">
+            <w:hyperlink r:id="rId232" w:anchor="Release_history" w:tooltip="Firefox version history" w:history="1">
               <w:r>
                 <w:rPr>
                   <w:rStyle w:val="Hyperlink"/>
@@ -14050,7 +14094,7 @@
               </w:rPr>
               <w:t>, </w:t>
             </w:r>
-            <w:hyperlink r:id="rId234" w:tooltip="Microsoft Edge" w:history="1">
+            <w:hyperlink r:id="rId233" w:tooltip="Microsoft Edge" w:history="1">
               <w:r>
                 <w:rPr>
                   <w:rStyle w:val="Hyperlink"/>
@@ -14069,7 +14113,7 @@
               </w:rPr>
               <w:t>, </w:t>
             </w:r>
-            <w:hyperlink r:id="rId235" w:tooltip="History of the Opera web browser" w:history="1">
+            <w:hyperlink r:id="rId234" w:tooltip="History of the Opera web browser" w:history="1">
               <w:r>
                 <w:rPr>
                   <w:rStyle w:val="Hyperlink"/>
@@ -14088,7 +14132,7 @@
               </w:rPr>
               <w:t>, </w:t>
             </w:r>
-            <w:hyperlink r:id="rId236" w:tooltip="Pale Moon" w:history="1">
+            <w:hyperlink r:id="rId235" w:tooltip="Pale Moon" w:history="1">
               <w:r>
                 <w:rPr>
                   <w:rStyle w:val="Hyperlink"/>
@@ -14107,7 +14151,7 @@
               </w:rPr>
               <w:t> 27.7.0–28.2.2, </w:t>
             </w:r>
-            <w:hyperlink r:id="rId237" w:tooltip="Safari (web browser)" w:history="1">
+            <w:hyperlink r:id="rId236" w:tooltip="Safari (web browser)" w:history="1">
               <w:r>
                 <w:rPr>
                   <w:rStyle w:val="Hyperlink"/>
@@ -14126,7 +14170,7 @@
               </w:rPr>
               <w:t>, </w:t>
             </w:r>
-            <w:hyperlink r:id="rId238" w:anchor="History" w:tooltip="Vivaldi (web browser)" w:history="1">
+            <w:hyperlink r:id="rId237" w:anchor="History" w:tooltip="Vivaldi (web browser)" w:history="1">
               <w:r>
                 <w:rPr>
                   <w:rStyle w:val="Hyperlink"/>
@@ -14181,7 +14225,7 @@
                 <w:szCs w:val="26"/>
               </w:rPr>
             </w:pPr>
-            <w:hyperlink r:id="rId239" w:tooltip="Google Chrome" w:history="1">
+            <w:hyperlink r:id="rId238" w:tooltip="Google Chrome" w:history="1">
               <w:r>
                 <w:rPr>
                   <w:rStyle w:val="Hyperlink"/>
@@ -14200,7 +14244,7 @@
               </w:rPr>
               <w:t>, </w:t>
             </w:r>
-            <w:hyperlink r:id="rId240" w:anchor="Release_history" w:tooltip="Firefox version history" w:history="1">
+            <w:hyperlink r:id="rId239" w:anchor="Release_history" w:tooltip="Firefox version history" w:history="1">
               <w:r>
                 <w:rPr>
                   <w:rStyle w:val="Hyperlink"/>
@@ -14219,7 +14263,7 @@
               </w:rPr>
               <w:t>, </w:t>
             </w:r>
-            <w:hyperlink r:id="rId241" w:tooltip="Microsoft Edge" w:history="1">
+            <w:hyperlink r:id="rId240" w:tooltip="Microsoft Edge" w:history="1">
               <w:r>
                 <w:rPr>
                   <w:rStyle w:val="Hyperlink"/>
@@ -14238,7 +14282,7 @@
               </w:rPr>
               <w:t>, </w:t>
             </w:r>
-            <w:hyperlink r:id="rId242" w:tooltip="History of the Opera web browser" w:history="1">
+            <w:hyperlink r:id="rId241" w:tooltip="History of the Opera web browser" w:history="1">
               <w:r>
                 <w:rPr>
                   <w:rStyle w:val="Hyperlink"/>
@@ -14257,7 +14301,7 @@
               </w:rPr>
               <w:t>, </w:t>
             </w:r>
-            <w:hyperlink r:id="rId243" w:tooltip="Pale Moon" w:history="1">
+            <w:hyperlink r:id="rId242" w:tooltip="Pale Moon" w:history="1">
               <w:r>
                 <w:rPr>
                   <w:rStyle w:val="Hyperlink"/>
@@ -14276,7 +14320,7 @@
               </w:rPr>
               <w:t> 28.3.0–28.8.0, </w:t>
             </w:r>
-            <w:hyperlink r:id="rId244" w:anchor="Safari_13" w:tooltip="Safari (web browser)" w:history="1">
+            <w:hyperlink r:id="rId243" w:anchor="Safari_13" w:tooltip="Safari (web browser)" w:history="1">
               <w:r>
                 <w:rPr>
                   <w:rStyle w:val="Hyperlink"/>
@@ -14353,7 +14397,7 @@
               </w:rPr>
               <w:t>, </w:t>
             </w:r>
-            <w:hyperlink r:id="rId245" w:tooltip="Vivaldi (web browser)" w:history="1">
+            <w:hyperlink r:id="rId244" w:tooltip="Vivaldi (web browser)" w:history="1">
               <w:r>
                 <w:rPr>
                   <w:rStyle w:val="Hyperlink"/>
@@ -14469,7 +14513,7 @@
                 <w:szCs w:val="26"/>
               </w:rPr>
             </w:pPr>
-            <w:hyperlink r:id="rId246" w:tooltip="Google Chrome" w:history="1">
+            <w:hyperlink r:id="rId245" w:tooltip="Google Chrome" w:history="1">
               <w:r>
                 <w:rPr>
                   <w:rStyle w:val="Hyperlink"/>
@@ -14488,7 +14532,7 @@
               </w:rPr>
               <w:t>, </w:t>
             </w:r>
-            <w:hyperlink r:id="rId247" w:anchor="Release_history" w:tooltip="Firefox version history" w:history="1">
+            <w:hyperlink r:id="rId246" w:anchor="Release_history" w:tooltip="Firefox version history" w:history="1">
               <w:r>
                 <w:rPr>
                   <w:rStyle w:val="Hyperlink"/>
@@ -14507,7 +14551,7 @@
               </w:rPr>
               <w:t>, </w:t>
             </w:r>
-            <w:hyperlink r:id="rId248" w:tooltip="Microsoft Edge" w:history="1">
+            <w:hyperlink r:id="rId247" w:tooltip="Microsoft Edge" w:history="1">
               <w:r>
                 <w:rPr>
                   <w:rStyle w:val="Hyperlink"/>
@@ -14526,7 +14570,7 @@
               </w:rPr>
               <w:t>, </w:t>
             </w:r>
-            <w:hyperlink r:id="rId249" w:tooltip="History of the Opera web browser" w:history="1">
+            <w:hyperlink r:id="rId248" w:tooltip="History of the Opera web browser" w:history="1">
               <w:r>
                 <w:rPr>
                   <w:rStyle w:val="Hyperlink"/>
@@ -14545,7 +14589,7 @@
               </w:rPr>
               <w:t>, </w:t>
             </w:r>
-            <w:hyperlink r:id="rId250" w:tooltip="Pale Moon" w:history="1">
+            <w:hyperlink r:id="rId249" w:tooltip="Pale Moon" w:history="1">
               <w:r>
                 <w:rPr>
                   <w:rStyle w:val="Hyperlink"/>
@@ -14564,7 +14608,7 @@
               </w:rPr>
               <w:t> 28.8.1–28.17.0, </w:t>
             </w:r>
-            <w:hyperlink r:id="rId251" w:anchor="Safari_14" w:tooltip="Safari (web browser)" w:history="1">
+            <w:hyperlink r:id="rId250" w:anchor="Safari_14" w:tooltip="Safari (web browser)" w:history="1">
               <w:r>
                 <w:rPr>
                   <w:rStyle w:val="Hyperlink"/>
@@ -14641,7 +14685,7 @@
               </w:rPr>
               <w:t>, </w:t>
             </w:r>
-            <w:hyperlink r:id="rId252" w:tooltip="Vivaldi (web browser)" w:history="1">
+            <w:hyperlink r:id="rId251" w:tooltip="Vivaldi (web browser)" w:history="1">
               <w:r>
                 <w:rPr>
                   <w:rStyle w:val="Hyperlink"/>
@@ -14755,7 +14799,7 @@
                 <w:szCs w:val="26"/>
               </w:rPr>
             </w:pPr>
-            <w:hyperlink r:id="rId253" w:tooltip="Google Chrome" w:history="1">
+            <w:hyperlink r:id="rId252" w:tooltip="Google Chrome" w:history="1">
               <w:r>
                 <w:rPr>
                   <w:rStyle w:val="Hyperlink"/>
@@ -14774,7 +14818,7 @@
               </w:rPr>
               <w:t>, </w:t>
             </w:r>
-            <w:hyperlink r:id="rId254" w:anchor="Release_history" w:tooltip="Firefox version history" w:history="1">
+            <w:hyperlink r:id="rId253" w:anchor="Release_history" w:tooltip="Firefox version history" w:history="1">
               <w:r>
                 <w:rPr>
                   <w:rStyle w:val="Hyperlink"/>
@@ -14793,7 +14837,7 @@
               </w:rPr>
               <w:t>, </w:t>
             </w:r>
-            <w:hyperlink r:id="rId255" w:tooltip="Microsoft Edge" w:history="1">
+            <w:hyperlink r:id="rId254" w:tooltip="Microsoft Edge" w:history="1">
               <w:r>
                 <w:rPr>
                   <w:rStyle w:val="Hyperlink"/>
@@ -14812,7 +14856,7 @@
               </w:rPr>
               <w:t>, </w:t>
             </w:r>
-            <w:hyperlink r:id="rId256" w:tooltip="History of the Opera web browser" w:history="1">
+            <w:hyperlink r:id="rId255" w:tooltip="History of the Opera web browser" w:history="1">
               <w:r>
                 <w:rPr>
                   <w:rStyle w:val="Hyperlink"/>
@@ -14831,7 +14875,7 @@
               </w:rPr>
               <w:t>, </w:t>
             </w:r>
-            <w:hyperlink r:id="rId257" w:tooltip="Pale Moon" w:history="1">
+            <w:hyperlink r:id="rId256" w:tooltip="Pale Moon" w:history="1">
               <w:r>
                 <w:rPr>
                   <w:rStyle w:val="Hyperlink"/>
@@ -14850,7 +14894,7 @@
               </w:rPr>
               <w:t> 29.0.0–29.4.3, </w:t>
             </w:r>
-            <w:hyperlink r:id="rId258" w:anchor="Safari_15" w:tooltip="Safari (web browser)" w:history="1">
+            <w:hyperlink r:id="rId257" w:anchor="Safari_15" w:tooltip="Safari (web browser)" w:history="1">
               <w:r>
                 <w:rPr>
                   <w:rStyle w:val="Hyperlink"/>
@@ -14869,7 +14913,7 @@
               </w:rPr>
               <w:t>, </w:t>
             </w:r>
-            <w:hyperlink r:id="rId259" w:tooltip="Vivaldi (web browser)" w:history="1">
+            <w:hyperlink r:id="rId258" w:tooltip="Vivaldi (web browser)" w:history="1">
               <w:r>
                 <w:rPr>
                   <w:rStyle w:val="Hyperlink"/>
@@ -14927,7 +14971,7 @@
                 <w:szCs w:val="26"/>
               </w:rPr>
             </w:pPr>
-            <w:hyperlink r:id="rId260" w:tooltip="Google Chrome" w:history="1">
+            <w:hyperlink r:id="rId259" w:tooltip="Google Chrome" w:history="1">
               <w:r>
                 <w:rPr>
                   <w:rStyle w:val="Hyperlink"/>
@@ -14946,7 +14990,7 @@
               </w:rPr>
               <w:t>, </w:t>
             </w:r>
-            <w:hyperlink r:id="rId261" w:anchor="Release_history" w:tooltip="Firefox version history" w:history="1">
+            <w:hyperlink r:id="rId260" w:anchor="Release_history" w:tooltip="Firefox version history" w:history="1">
               <w:r>
                 <w:rPr>
                   <w:rStyle w:val="Hyperlink"/>
@@ -14965,7 +15009,7 @@
               </w:rPr>
               <w:t>, </w:t>
             </w:r>
-            <w:hyperlink r:id="rId262" w:tooltip="Microsoft Edge" w:history="1">
+            <w:hyperlink r:id="rId261" w:tooltip="Microsoft Edge" w:history="1">
               <w:r>
                 <w:rPr>
                   <w:rStyle w:val="Hyperlink"/>
@@ -14984,7 +15028,7 @@
               </w:rPr>
               <w:t>, </w:t>
             </w:r>
-            <w:hyperlink r:id="rId263" w:tooltip="History of the Opera web browser" w:history="1">
+            <w:hyperlink r:id="rId262" w:tooltip="History of the Opera web browser" w:history="1">
               <w:r>
                 <w:rPr>
                   <w:rStyle w:val="Hyperlink"/>
@@ -15003,7 +15047,7 @@
               </w:rPr>
               <w:t>, </w:t>
             </w:r>
-            <w:hyperlink r:id="rId264" w:tooltip="Pale Moon" w:history="1">
+            <w:hyperlink r:id="rId263" w:tooltip="Pale Moon" w:history="1">
               <w:r>
                 <w:rPr>
                   <w:rStyle w:val="Hyperlink"/>
@@ -15022,7 +15066,7 @@
               </w:rPr>
               <w:t> 29.4.4-31.4.2, </w:t>
             </w:r>
-            <w:hyperlink r:id="rId265" w:tooltip="Safari (web browser)" w:history="1">
+            <w:hyperlink r:id="rId264" w:tooltip="Safari (web browser)" w:history="1">
               <w:r>
                 <w:rPr>
                   <w:rStyle w:val="Hyperlink"/>
@@ -15041,7 +15085,7 @@
               </w:rPr>
               <w:t>, </w:t>
             </w:r>
-            <w:hyperlink r:id="rId266" w:tooltip="Vivaldi (web browser)" w:history="1">
+            <w:hyperlink r:id="rId265" w:tooltip="Vivaldi (web browser)" w:history="1">
               <w:r>
                 <w:rPr>
                   <w:rStyle w:val="Hyperlink"/>
@@ -15096,7 +15140,7 @@
                 <w:szCs w:val="26"/>
               </w:rPr>
             </w:pPr>
-            <w:hyperlink r:id="rId267" w:tooltip="Google Chrome" w:history="1">
+            <w:hyperlink r:id="rId266" w:tooltip="Google Chrome" w:history="1">
               <w:r>
                 <w:rPr>
                   <w:rStyle w:val="Hyperlink"/>
@@ -15115,7 +15159,7 @@
               </w:rPr>
               <w:t>, </w:t>
             </w:r>
-            <w:hyperlink r:id="rId268" w:anchor="Release_history" w:tooltip="Firefox version history" w:history="1">
+            <w:hyperlink r:id="rId267" w:anchor="Release_history" w:tooltip="Firefox version history" w:history="1">
               <w:r>
                 <w:rPr>
                   <w:rStyle w:val="Hyperlink"/>
@@ -15134,7 +15178,7 @@
               </w:rPr>
               <w:t>, </w:t>
             </w:r>
-            <w:hyperlink r:id="rId269" w:tooltip="Microsoft Edge" w:history="1">
+            <w:hyperlink r:id="rId268" w:tooltip="Microsoft Edge" w:history="1">
               <w:r>
                 <w:rPr>
                   <w:rStyle w:val="Hyperlink"/>
@@ -15153,7 +15197,7 @@
               </w:rPr>
               <w:t>, </w:t>
             </w:r>
-            <w:hyperlink r:id="rId270" w:tooltip="History of the Opera web browser" w:history="1">
+            <w:hyperlink r:id="rId269" w:tooltip="History of the Opera web browser" w:history="1">
               <w:r>
                 <w:rPr>
                   <w:rStyle w:val="Hyperlink"/>
@@ -15172,7 +15216,7 @@
               </w:rPr>
               <w:t>, </w:t>
             </w:r>
-            <w:hyperlink r:id="rId271" w:tooltip="Pale Moon" w:history="1">
+            <w:hyperlink r:id="rId270" w:tooltip="Pale Moon" w:history="1">
               <w:r>
                 <w:rPr>
                   <w:rStyle w:val="Hyperlink"/>
@@ -15191,7 +15235,7 @@
               </w:rPr>
               <w:t> 31.4.3-32.5.2, </w:t>
             </w:r>
-            <w:hyperlink r:id="rId272" w:tooltip="Safari (web browser)" w:history="1">
+            <w:hyperlink r:id="rId271" w:tooltip="Safari (web browser)" w:history="1">
               <w:r>
                 <w:rPr>
                   <w:rStyle w:val="Hyperlink"/>
@@ -15210,7 +15254,7 @@
               </w:rPr>
               <w:t>, </w:t>
             </w:r>
-            <w:hyperlink r:id="rId273" w:tooltip="Vivaldi (web browser)" w:history="1">
+            <w:hyperlink r:id="rId272" w:tooltip="Vivaldi (web browser)" w:history="1">
               <w:r>
                 <w:rPr>
                   <w:rStyle w:val="Hyperlink"/>
@@ -15229,7 +15273,7 @@
               </w:rPr>
               <w:t>, </w:t>
             </w:r>
-            <w:hyperlink r:id="rId274" w:tooltip="Arc (web browser)" w:history="1">
+            <w:hyperlink r:id="rId273" w:tooltip="Arc (web browser)" w:history="1">
               <w:r>
                 <w:rPr>
                   <w:rStyle w:val="Hyperlink"/>
@@ -15287,7 +15331,7 @@
                 <w:szCs w:val="26"/>
               </w:rPr>
             </w:pPr>
-            <w:hyperlink r:id="rId275" w:tooltip="Google Chrome" w:history="1">
+            <w:hyperlink r:id="rId274" w:tooltip="Google Chrome" w:history="1">
               <w:r>
                 <w:rPr>
                   <w:rStyle w:val="Hyperlink"/>
@@ -15306,7 +15350,7 @@
               </w:rPr>
               <w:t>, </w:t>
             </w:r>
-            <w:hyperlink r:id="rId276" w:anchor="Release_history" w:tooltip="Firefox version history" w:history="1">
+            <w:hyperlink r:id="rId275" w:anchor="Release_history" w:tooltip="Firefox version history" w:history="1">
               <w:r>
                 <w:rPr>
                   <w:rStyle w:val="Hyperlink"/>
@@ -15325,7 +15369,7 @@
               </w:rPr>
               <w:t>, </w:t>
             </w:r>
-            <w:hyperlink r:id="rId277" w:tooltip="Microsoft Edge" w:history="1">
+            <w:hyperlink r:id="rId276" w:tooltip="Microsoft Edge" w:history="1">
               <w:r>
                 <w:rPr>
                   <w:rStyle w:val="Hyperlink"/>
@@ -15344,7 +15388,7 @@
               </w:rPr>
               <w:t>, </w:t>
             </w:r>
-            <w:hyperlink r:id="rId278" w:tooltip="History of the Opera web browser" w:history="1">
+            <w:hyperlink r:id="rId277" w:tooltip="History of the Opera web browser" w:history="1">
               <w:r>
                 <w:rPr>
                   <w:rStyle w:val="Hyperlink"/>
@@ -15363,7 +15407,7 @@
               </w:rPr>
               <w:t>, </w:t>
             </w:r>
-            <w:hyperlink r:id="rId279" w:tooltip="Pale Moon" w:history="1">
+            <w:hyperlink r:id="rId278" w:tooltip="Pale Moon" w:history="1">
               <w:r>
                 <w:rPr>
                   <w:rStyle w:val="Hyperlink"/>
@@ -15382,7 +15426,7 @@
               </w:rPr>
               <w:t> 33-Current, </w:t>
             </w:r>
-            <w:hyperlink r:id="rId280" w:tooltip="Safari (web browser)" w:history="1">
+            <w:hyperlink r:id="rId279" w:tooltip="Safari (web browser)" w:history="1">
               <w:r>
                 <w:rPr>
                   <w:rStyle w:val="Hyperlink"/>
@@ -15401,7 +15445,7 @@
               </w:rPr>
               <w:t>, </w:t>
             </w:r>
-            <w:hyperlink r:id="rId281" w:tooltip="Vivaldi (web browser)" w:history="1">
+            <w:hyperlink r:id="rId280" w:tooltip="Vivaldi (web browser)" w:history="1">
               <w:r>
                 <w:rPr>
                   <w:rStyle w:val="Hyperlink"/>
@@ -15420,7 +15464,7 @@
               </w:rPr>
               <w:t>, </w:t>
             </w:r>
-            <w:hyperlink r:id="rId282" w:tooltip="Arc (web browser)" w:history="1">
+            <w:hyperlink r:id="rId281" w:tooltip="Arc (web browser)" w:history="1">
               <w:r>
                 <w:rPr>
                   <w:rStyle w:val="Hyperlink"/>
@@ -15439,7 +15483,7 @@
               </w:rPr>
               <w:t>, </w:t>
             </w:r>
-            <w:hyperlink r:id="rId283" w:tooltip="Ecosia" w:history="1">
+            <w:hyperlink r:id="rId282" w:tooltip="Ecosia" w:history="1">
               <w:r>
                 <w:rPr>
                   <w:rStyle w:val="Hyperlink"/>
@@ -18376,17 +18420,7 @@
                                 <w:sz w:val="30"/>
                                 <w:szCs w:val="30"/>
                               </w:rPr>
-                              <w:t>HTTP</w:t>
-                            </w:r>
-                            <w:r>
-                              <w:rPr>
-                                <w:rFonts w:ascii="Verdana" w:hAnsi="Verdana"/>
-                                <w:b/>
-                                <w:bCs/>
-                                <w:sz w:val="30"/>
-                                <w:szCs w:val="30"/>
-                              </w:rPr>
-                              <w:t>S</w:t>
+                              <w:t>HTTPS</w:t>
                             </w:r>
                           </w:p>
                         </w:txbxContent>
@@ -18427,17 +18461,7 @@
                           <w:sz w:val="30"/>
                           <w:szCs w:val="30"/>
                         </w:rPr>
-                        <w:t>HTTP</w:t>
-                      </w:r>
-                      <w:r>
-                        <w:rPr>
-                          <w:rFonts w:ascii="Verdana" w:hAnsi="Verdana"/>
-                          <w:b/>
-                          <w:bCs/>
-                          <w:sz w:val="30"/>
-                          <w:szCs w:val="30"/>
-                        </w:rPr>
-                        <w:t>S</w:t>
+                        <w:t>HTTPS</w:t>
                       </w:r>
                     </w:p>
                   </w:txbxContent>
@@ -20077,7 +20101,7 @@
         </w:rPr>
         <w:lastRenderedPageBreak/>
         <w:pict w14:anchorId="05939E00">
-          <v:rect id="_x0000_i1055" style="width:0;height:1.5pt" o:hralign="center" o:hrstd="t" o:hr="t" fillcolor="#a0a0a0" stroked="f"/>
+          <v:rect id="_x0000_i1025" style="width:0;height:1.5pt" o:hralign="center" o:hrstd="t" o:hr="t" fillcolor="#a0a0a0" stroked="f"/>
         </w:pict>
       </w:r>
     </w:p>
@@ -20243,7 +20267,7 @@
           <w:szCs w:val="26"/>
         </w:rPr>
         <w:pict w14:anchorId="0B211FB3">
-          <v:rect id="_x0000_i1056" style="width:0;height:1.5pt" o:hralign="center" o:hrstd="t" o:hr="t" fillcolor="#a0a0a0" stroked="f"/>
+          <v:rect id="_x0000_i1026" style="width:0;height:1.5pt" o:hralign="center" o:hrstd="t" o:hr="t" fillcolor="#a0a0a0" stroked="f"/>
         </w:pict>
       </w:r>
     </w:p>
@@ -20409,7 +20433,7 @@
           <w:szCs w:val="26"/>
         </w:rPr>
         <w:pict w14:anchorId="10C9C443">
-          <v:rect id="_x0000_i1057" style="width:0;height:1.5pt" o:hralign="center" o:hrstd="t" o:hr="t" fillcolor="#a0a0a0" stroked="f"/>
+          <v:rect id="_x0000_i1027" style="width:0;height:1.5pt" o:hralign="center" o:hrstd="t" o:hr="t" fillcolor="#a0a0a0" stroked="f"/>
         </w:pict>
       </w:r>
     </w:p>
@@ -20566,7 +20590,7 @@
           <w:szCs w:val="26"/>
         </w:rPr>
         <w:pict w14:anchorId="277AF497">
-          <v:rect id="_x0000_i1058" style="width:0;height:1.5pt" o:hralign="center" o:hrstd="t" o:hr="t" fillcolor="#a0a0a0" stroked="f"/>
+          <v:rect id="_x0000_i1028" style="width:0;height:1.5pt" o:hralign="center" o:hrstd="t" o:hr="t" fillcolor="#a0a0a0" stroked="f"/>
         </w:pict>
       </w:r>
     </w:p>
@@ -20745,7 +20769,7 @@
           <w:szCs w:val="26"/>
         </w:rPr>
         <w:pict w14:anchorId="33060BD0">
-          <v:rect id="_x0000_i1059" style="width:0;height:1.5pt" o:hralign="center" o:hrstd="t" o:hr="t" fillcolor="#a0a0a0" stroked="f"/>
+          <v:rect id="_x0000_i1029" style="width:0;height:1.5pt" o:hralign="center" o:hrstd="t" o:hr="t" fillcolor="#a0a0a0" stroked="f"/>
         </w:pict>
       </w:r>
     </w:p>
@@ -21054,7 +21078,7 @@
           <w:szCs w:val="26"/>
         </w:rPr>
         <w:pict w14:anchorId="13C9C1C2">
-          <v:rect id="_x0000_i1071" style="width:0;height:1.5pt" o:hralign="center" o:hrstd="t" o:hr="t" fillcolor="#a0a0a0" stroked="f"/>
+          <v:rect id="_x0000_i1030" style="width:0;height:1.5pt" o:hralign="center" o:hrstd="t" o:hr="t" fillcolor="#a0a0a0" stroked="f"/>
         </w:pict>
       </w:r>
     </w:p>
@@ -21156,8 +21180,18 @@
           <w:sz w:val="26"/>
           <w:szCs w:val="26"/>
         </w:rPr>
-        <w:t>/about</w:t>
-      </w:r>
+        <w:t>/</w:t>
+      </w:r>
+      <w:proofErr w:type="gramStart"/>
+      <w:r>
+        <w:rPr>
+          <w:rFonts w:ascii="Verdana" w:hAnsi="Verdana"/>
+          <w:sz w:val="26"/>
+          <w:szCs w:val="26"/>
+        </w:rPr>
+        <w:t>about</w:t>
+      </w:r>
+      <w:proofErr w:type="gramEnd"/>
     </w:p>
     <w:p>
       <w:pPr>
@@ -21333,6 +21367,59 @@
           <w:szCs w:val="26"/>
         </w:rPr>
       </w:pPr>
+      <w:r>
+        <w:rPr>
+          <w:noProof/>
+        </w:rPr>
+        <w:drawing>
+          <wp:inline distT="0" distB="0" distL="0" distR="0" wp14:anchorId="19095BD0" wp14:editId="1713FF93">
+            <wp:extent cx="5715000" cy="3495040"/>
+            <wp:effectExtent l="0" t="0" r="0" b="0"/>
+            <wp:docPr id="1130739769" name="Picture 1" descr="SEO Friendly URL Structure For Your Website"/>
+            <wp:cNvGraphicFramePr>
+              <a:graphicFrameLocks xmlns:a="http://schemas.openxmlformats.org/drawingml/2006/main" noChangeAspect="1"/>
+            </wp:cNvGraphicFramePr>
+            <a:graphic xmlns:a="http://schemas.openxmlformats.org/drawingml/2006/main">
+              <a:graphicData uri="http://schemas.openxmlformats.org/drawingml/2006/picture">
+                <pic:pic xmlns:pic="http://schemas.openxmlformats.org/drawingml/2006/picture">
+                  <pic:nvPicPr>
+                    <pic:cNvPr id="0" name="Picture 1" descr="SEO Friendly URL Structure For Your Website"/>
+                    <pic:cNvPicPr>
+                      <a:picLocks noChangeAspect="1" noChangeArrowheads="1"/>
+                    </pic:cNvPicPr>
+                  </pic:nvPicPr>
+                  <pic:blipFill>
+                    <a:blip r:embed="rId283">
+                      <a:extLst>
+                        <a:ext uri="{28A0092B-C50C-407E-A947-70E740481C1C}">
+                          <a14:useLocalDpi xmlns:a14="http://schemas.microsoft.com/office/drawing/2010/main" val="0"/>
+                        </a:ext>
+                      </a:extLst>
+                    </a:blip>
+                    <a:srcRect/>
+                    <a:stretch>
+                      <a:fillRect/>
+                    </a:stretch>
+                  </pic:blipFill>
+                  <pic:spPr bwMode="auto">
+                    <a:xfrm>
+                      <a:off x="0" y="0"/>
+                      <a:ext cx="5715000" cy="3495040"/>
+                    </a:xfrm>
+                    <a:prstGeom prst="rect">
+                      <a:avLst/>
+                    </a:prstGeom>
+                    <a:noFill/>
+                    <a:ln>
+                      <a:noFill/>
+                    </a:ln>
+                  </pic:spPr>
+                </pic:pic>
+              </a:graphicData>
+            </a:graphic>
+          </wp:inline>
+        </w:drawing>
+      </w:r>
     </w:p>
     <w:p>
       <w:pPr>
@@ -21777,24 +21864,64 @@
           <w:sz w:val="26"/>
           <w:szCs w:val="26"/>
         </w:rPr>
-        <w:t>1]h${title$}*5</w:t>
-      </w:r>
-    </w:p>
-    <w:p>
-      <w:pPr>
-        <w:rPr>
-          <w:rFonts w:ascii="Verdana" w:hAnsi="Verdana"/>
-          <w:sz w:val="26"/>
-          <w:szCs w:val="26"/>
-        </w:rPr>
-      </w:pPr>
-      <w:r>
-        <w:rPr>
-          <w:rFonts w:ascii="Verdana" w:hAnsi="Verdana"/>
-          <w:sz w:val="26"/>
-          <w:szCs w:val="26"/>
-        </w:rPr>
-        <w:t>Gives Five Heading With Text</w:t>
+        <w:t>1]h${title</w:t>
+      </w:r>
+      <w:proofErr w:type="gramStart"/>
+      <w:r>
+        <w:rPr>
+          <w:rFonts w:ascii="Verdana" w:hAnsi="Verdana"/>
+          <w:b/>
+          <w:bCs/>
+          <w:sz w:val="26"/>
+          <w:szCs w:val="26"/>
+        </w:rPr>
+        <w:t>$}*</w:t>
+      </w:r>
+      <w:proofErr w:type="gramEnd"/>
+      <w:r>
+        <w:rPr>
+          <w:rFonts w:ascii="Verdana" w:hAnsi="Verdana"/>
+          <w:b/>
+          <w:bCs/>
+          <w:sz w:val="26"/>
+          <w:szCs w:val="26"/>
+        </w:rPr>
+        <w:t>5</w:t>
+      </w:r>
+    </w:p>
+    <w:p>
+      <w:pPr>
+        <w:rPr>
+          <w:rFonts w:ascii="Verdana" w:hAnsi="Verdana"/>
+          <w:sz w:val="26"/>
+          <w:szCs w:val="26"/>
+        </w:rPr>
+      </w:pPr>
+      <w:r>
+        <w:rPr>
+          <w:rFonts w:ascii="Verdana" w:hAnsi="Verdana"/>
+          <w:sz w:val="26"/>
+          <w:szCs w:val="26"/>
+        </w:rPr>
+        <w:t xml:space="preserve">Gives Five Heading </w:t>
+      </w:r>
+      <w:proofErr w:type="gramStart"/>
+      <w:r>
+        <w:rPr>
+          <w:rFonts w:ascii="Verdana" w:hAnsi="Verdana"/>
+          <w:sz w:val="26"/>
+          <w:szCs w:val="26"/>
+        </w:rPr>
+        <w:t>With</w:t>
+      </w:r>
+      <w:proofErr w:type="gramEnd"/>
+      <w:r>
+        <w:rPr>
+          <w:rFonts w:ascii="Verdana" w:hAnsi="Verdana"/>
+          <w:sz w:val="26"/>
+          <w:szCs w:val="26"/>
+        </w:rPr>
+        <w:t xml:space="preserve"> Text</w:t>
       </w:r>
     </w:p>
     <w:p>
@@ -27728,6 +27855,7 @@
   <w:style w:type="character" w:default="1" w:styleId="DefaultParagraphFont">
     <w:name w:val="Default Paragraph Font"/>
     <w:uiPriority w:val="1"/>
+    <w:semiHidden/>
     <w:unhideWhenUsed/>
   </w:style>
   <w:style w:type="table" w:default="1" w:styleId="TableNormal">

</xml_diff>

<commit_message>
remove unnecessary blank lines in HTML notes document for improved readability
</commit_message>
<xml_diff>
--- a/NOTES/HTML.docx
+++ b/NOTES/HTML.docx
@@ -21528,123 +21528,6 @@
           <w:szCs w:val="26"/>
         </w:rPr>
       </w:pPr>
-    </w:p>
-    <w:p>
-      <w:pPr>
-        <w:rPr>
-          <w:rFonts w:ascii="Verdana" w:hAnsi="Verdana"/>
-          <w:sz w:val="26"/>
-          <w:szCs w:val="26"/>
-        </w:rPr>
-      </w:pPr>
-    </w:p>
-    <w:p>
-      <w:pPr>
-        <w:rPr>
-          <w:rFonts w:ascii="Verdana" w:hAnsi="Verdana"/>
-          <w:sz w:val="26"/>
-          <w:szCs w:val="26"/>
-        </w:rPr>
-      </w:pPr>
-    </w:p>
-    <w:p>
-      <w:pPr>
-        <w:rPr>
-          <w:rFonts w:ascii="Verdana" w:hAnsi="Verdana"/>
-          <w:sz w:val="26"/>
-          <w:szCs w:val="26"/>
-        </w:rPr>
-      </w:pPr>
-    </w:p>
-    <w:p>
-      <w:pPr>
-        <w:rPr>
-          <w:rFonts w:ascii="Verdana" w:hAnsi="Verdana"/>
-          <w:sz w:val="26"/>
-          <w:szCs w:val="26"/>
-        </w:rPr>
-      </w:pPr>
-    </w:p>
-    <w:p>
-      <w:pPr>
-        <w:rPr>
-          <w:rFonts w:ascii="Verdana" w:hAnsi="Verdana"/>
-          <w:sz w:val="26"/>
-          <w:szCs w:val="26"/>
-        </w:rPr>
-      </w:pPr>
-    </w:p>
-    <w:p>
-      <w:pPr>
-        <w:rPr>
-          <w:rFonts w:ascii="Verdana" w:hAnsi="Verdana"/>
-          <w:sz w:val="26"/>
-          <w:szCs w:val="26"/>
-        </w:rPr>
-      </w:pPr>
-    </w:p>
-    <w:p>
-      <w:pPr>
-        <w:rPr>
-          <w:rFonts w:ascii="Verdana" w:hAnsi="Verdana"/>
-          <w:sz w:val="26"/>
-          <w:szCs w:val="26"/>
-        </w:rPr>
-      </w:pPr>
-    </w:p>
-    <w:p>
-      <w:pPr>
-        <w:rPr>
-          <w:rFonts w:ascii="Verdana" w:hAnsi="Verdana"/>
-          <w:sz w:val="26"/>
-          <w:szCs w:val="26"/>
-        </w:rPr>
-      </w:pPr>
-    </w:p>
-    <w:p>
-      <w:pPr>
-        <w:rPr>
-          <w:rFonts w:ascii="Verdana" w:hAnsi="Verdana"/>
-          <w:sz w:val="26"/>
-          <w:szCs w:val="26"/>
-        </w:rPr>
-      </w:pPr>
-    </w:p>
-    <w:p>
-      <w:pPr>
-        <w:rPr>
-          <w:rFonts w:ascii="Verdana" w:hAnsi="Verdana"/>
-          <w:sz w:val="26"/>
-          <w:szCs w:val="26"/>
-        </w:rPr>
-      </w:pPr>
-    </w:p>
-    <w:p>
-      <w:pPr>
-        <w:rPr>
-          <w:rFonts w:ascii="Verdana" w:hAnsi="Verdana"/>
-          <w:sz w:val="26"/>
-          <w:szCs w:val="26"/>
-        </w:rPr>
-      </w:pPr>
-    </w:p>
-    <w:p>
-      <w:pPr>
-        <w:rPr>
-          <w:rFonts w:ascii="Verdana" w:hAnsi="Verdana"/>
-          <w:sz w:val="26"/>
-          <w:szCs w:val="26"/>
-        </w:rPr>
-      </w:pPr>
-    </w:p>
-    <w:p>
-      <w:pPr>
-        <w:rPr>
-          <w:rFonts w:ascii="Verdana" w:hAnsi="Verdana"/>
-          <w:sz w:val="26"/>
-          <w:szCs w:val="26"/>
-        </w:rPr>
-      </w:pPr>
       <w:r>
         <w:rPr>
           <w:rFonts w:ascii="Verdana" w:hAnsi="Verdana"/>
@@ -21652,16 +21535,17 @@
           <w:sz w:val="26"/>
           <w:szCs w:val="26"/>
         </w:rPr>
+        <w:lastRenderedPageBreak/>
         <mc:AlternateContent>
           <mc:Choice Requires="wps">
             <w:drawing>
-              <wp:anchor distT="0" distB="0" distL="114300" distR="114300" simplePos="0" relativeHeight="251667456" behindDoc="0" locked="0" layoutInCell="1" allowOverlap="1" wp14:anchorId="79BEE011" wp14:editId="2AA6D4ED">
+              <wp:anchor distT="0" distB="0" distL="114300" distR="114300" simplePos="0" relativeHeight="251667456" behindDoc="0" locked="0" layoutInCell="1" allowOverlap="1" wp14:anchorId="79BEE011" wp14:editId="4C5F9352">
                 <wp:simplePos x="0" y="0"/>
                 <wp:positionH relativeFrom="margin">
-                  <wp:posOffset>0</wp:posOffset>
+                  <wp:align>center</wp:align>
                 </wp:positionH>
                 <wp:positionV relativeFrom="paragraph">
-                  <wp:posOffset>38100</wp:posOffset>
+                  <wp:posOffset>-38100</wp:posOffset>
                 </wp:positionV>
                 <wp:extent cx="3478530" cy="472440"/>
                 <wp:effectExtent l="57150" t="38100" r="64770" b="80010"/>
@@ -21757,7 +21641,7 @@
           </mc:Choice>
           <mc:Fallback>
             <w:pict>
-              <v:rect w14:anchorId="79BEE011" id="Rectangle 5" o:spid="_x0000_s1035" style="position:absolute;margin-left:0;margin-top:3pt;width:273.9pt;height:37.2pt;z-index:251667456;visibility:visible;mso-wrap-style:square;mso-width-percent:0;mso-height-percent:0;mso-wrap-distance-left:9pt;mso-wrap-distance-top:0;mso-wrap-distance-right:9pt;mso-wrap-distance-bottom:0;mso-position-horizontal:absolute;mso-position-horizontal-relative:margin;mso-position-vertical:absolute;mso-position-vertical-relative:text;mso-width-percent:0;mso-height-percent:0;mso-width-relative:margin;mso-height-relative:margin;v-text-anchor:middle" o:gfxdata="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" fillcolor="#ee853d [3029]" stroked="f">
+              <v:rect w14:anchorId="79BEE011" id="Rectangle 5" o:spid="_x0000_s1035" style="position:absolute;margin-left:0;margin-top:-3pt;width:273.9pt;height:37.2pt;z-index:251667456;visibility:visible;mso-wrap-style:square;mso-width-percent:0;mso-height-percent:0;mso-wrap-distance-left:9pt;mso-wrap-distance-top:0;mso-wrap-distance-right:9pt;mso-wrap-distance-bottom:0;mso-position-horizontal:center;mso-position-horizontal-relative:margin;mso-position-vertical:absolute;mso-position-vertical-relative:text;mso-width-percent:0;mso-height-percent:0;mso-width-relative:margin;mso-height-relative:margin;v-text-anchor:middle" o:gfxdata="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" fillcolor="#ee853d [3029]" stroked="f">
                 <v:fill color2="#ec7a2d [3173]" rotate="t" colors="0 #f18c55;.5 #f67b28;1 #e56b17" focus="100%" type="gradient">
                   <o:fill v:ext="view" type="gradientUnscaled"/>
                 </v:fill>
@@ -21809,24 +21693,6 @@
           </mc:Fallback>
         </mc:AlternateContent>
       </w:r>
-    </w:p>
-    <w:p>
-      <w:pPr>
-        <w:rPr>
-          <w:rFonts w:ascii="Verdana" w:hAnsi="Verdana"/>
-          <w:sz w:val="26"/>
-          <w:szCs w:val="26"/>
-        </w:rPr>
-      </w:pPr>
-    </w:p>
-    <w:p>
-      <w:pPr>
-        <w:rPr>
-          <w:rFonts w:ascii="Verdana" w:hAnsi="Verdana"/>
-          <w:sz w:val="26"/>
-          <w:szCs w:val="26"/>
-        </w:rPr>
-      </w:pPr>
     </w:p>
     <w:p>
       <w:pPr>

</xml_diff>